<commit_message>
changes deployed to Production
</commit_message>
<xml_diff>
--- a/ALR-DocgenTemplates/InvoiceTemplate.docx
+++ b/ALR-DocgenTemplates/InvoiceTemplate.docx
@@ -1,6 +1,6 @@
 
 <file path=word/document.xml><?xml version="1.0" encoding="utf-8"?>
-<w:document xmlns:wpc="http://schemas.microsoft.com/office/word/2010/wordprocessingCanvas" xmlns:cx="http://schemas.microsoft.com/office/drawing/2014/chartex" xmlns:cx1="http://schemas.microsoft.com/office/drawing/2015/9/8/chartex" xmlns:cx2="http://schemas.microsoft.com/office/drawing/2015/10/21/chartex" xmlns:cx3="http://schemas.microsoft.com/office/drawing/2016/5/9/chartex" xmlns:cx4="http://schemas.microsoft.com/office/drawing/2016/5/10/chartex" xmlns:cx5="http://schemas.microsoft.com/office/drawing/2016/5/11/chartex" xmlns:cx6="http://schemas.microsoft.com/office/drawing/2016/5/12/chartex" xmlns:cx7="http://schemas.microsoft.com/office/drawing/2016/5/13/chartex" xmlns:cx8="http://schemas.microsoft.com/office/drawing/2016/5/14/chartex" xmlns:mc="http://schemas.openxmlformats.org/markup-compatibility/2006" xmlns:aink="http://schemas.microsoft.com/office/drawing/2016/ink" xmlns:am3d="http://schemas.microsoft.com/office/drawing/2017/model3d" xmlns:o="urn:schemas-microsoft-com:office:office" xmlns:oel="http://schemas.microsoft.com/office/2019/extlst" xmlns:r="http://schemas.openxmlformats.org/officeDocument/2006/relationships" xmlns:m="http://schemas.openxmlformats.org/officeDocument/2006/math" xmlns:v="urn:schemas-microsoft-com:vml" xmlns:wp14="http://schemas.microsoft.com/office/word/2010/wordprocessingDrawing" xmlns:wp="http://schemas.openxmlformats.org/drawingml/2006/wordprocessingDrawing" xmlns:w10="urn:schemas-microsoft-com:office:word" xmlns:w="http://schemas.openxmlformats.org/wordprocessingml/2006/main" xmlns:w14="http://schemas.microsoft.com/office/word/2010/wordml" xmlns:w15="http://schemas.microsoft.com/office/word/2012/wordml" xmlns:w16cex="http://schemas.microsoft.com/office/word/2018/wordml/cex" xmlns:w16cid="http://schemas.microsoft.com/office/word/2016/wordml/cid" xmlns:w16="http://schemas.microsoft.com/office/word/2018/wordml" xmlns:w16sdtdh="http://schemas.microsoft.com/office/word/2020/wordml/sdtdatahash" xmlns:w16se="http://schemas.microsoft.com/office/word/2015/wordml/symex" xmlns:wpg="http://schemas.microsoft.com/office/word/2010/wordprocessingGroup" xmlns:wpi="http://schemas.microsoft.com/office/word/2010/wordprocessingInk" xmlns:wne="http://schemas.microsoft.com/office/word/2006/wordml" xmlns:wps="http://schemas.microsoft.com/office/word/2010/wordprocessingShape" mc:Ignorable="w14 w15 w16se w16cid w16 w16cex w16sdtdh wp14">
+<w:document xmlns:wpc="http://schemas.microsoft.com/office/word/2010/wordprocessingCanvas" xmlns:cx="http://schemas.microsoft.com/office/drawing/2014/chartex" xmlns:cx1="http://schemas.microsoft.com/office/drawing/2015/9/8/chartex" xmlns:cx2="http://schemas.microsoft.com/office/drawing/2015/10/21/chartex" xmlns:cx3="http://schemas.microsoft.com/office/drawing/2016/5/9/chartex" xmlns:cx4="http://schemas.microsoft.com/office/drawing/2016/5/10/chartex" xmlns:cx5="http://schemas.microsoft.com/office/drawing/2016/5/11/chartex" xmlns:cx6="http://schemas.microsoft.com/office/drawing/2016/5/12/chartex" xmlns:cx7="http://schemas.microsoft.com/office/drawing/2016/5/13/chartex" xmlns:cx8="http://schemas.microsoft.com/office/drawing/2016/5/14/chartex" xmlns:mc="http://schemas.openxmlformats.org/markup-compatibility/2006" xmlns:aink="http://schemas.microsoft.com/office/drawing/2016/ink" xmlns:am3d="http://schemas.microsoft.com/office/drawing/2017/model3d" xmlns:o="urn:schemas-microsoft-com:office:office" xmlns:oel="http://schemas.microsoft.com/office/2019/extlst" xmlns:r="http://schemas.openxmlformats.org/officeDocument/2006/relationships" xmlns:m="http://schemas.openxmlformats.org/officeDocument/2006/math" xmlns:v="urn:schemas-microsoft-com:vml" xmlns:wp14="http://schemas.microsoft.com/office/word/2010/wordprocessingDrawing" xmlns:wp="http://schemas.openxmlformats.org/drawingml/2006/wordprocessingDrawing" xmlns:w10="urn:schemas-microsoft-com:office:word" xmlns:w="http://schemas.openxmlformats.org/wordprocessingml/2006/main" xmlns:w14="http://schemas.microsoft.com/office/word/2010/wordml" xmlns:w15="http://schemas.microsoft.com/office/word/2012/wordml" xmlns:w16cex="http://schemas.microsoft.com/office/word/2018/wordml/cex" xmlns:w16cid="http://schemas.microsoft.com/office/word/2016/wordml/cid" xmlns:w16="http://schemas.microsoft.com/office/word/2018/wordml" xmlns:w16du="http://schemas.microsoft.com/office/word/2023/wordml/word16du" xmlns:w16sdtdh="http://schemas.microsoft.com/office/word/2020/wordml/sdtdatahash" xmlns:w16sdtfl="http://schemas.microsoft.com/office/word/2024/wordml/sdtformatlock" xmlns:w16se="http://schemas.microsoft.com/office/word/2015/wordml/symex" xmlns:wpg="http://schemas.microsoft.com/office/word/2010/wordprocessingGroup" xmlns:wpi="http://schemas.microsoft.com/office/word/2010/wordprocessingInk" xmlns:wne="http://schemas.microsoft.com/office/word/2006/wordml" xmlns:wps="http://schemas.microsoft.com/office/word/2010/wordprocessingShape" mc:Ignorable="w14 w15 w16se w16cid w16 w16cex w16sdtdh w16sdtfl w16du wp14">
   <w:body>
     <w:p>
       <w:pPr>
@@ -12,8 +12,12 @@
           <w:szCs w:val="34"/>
         </w:rPr>
         <w:sectPr>
-          <w:headerReference w:type="default" r:id="rId6"/>
-          <w:footerReference w:type="default" r:id="rId7"/>
+          <w:headerReference w:type="even" r:id="rId6"/>
+          <w:headerReference w:type="default" r:id="rId7"/>
+          <w:footerReference w:type="even" r:id="rId8"/>
+          <w:footerReference w:type="default" r:id="rId9"/>
+          <w:headerReference w:type="first" r:id="rId10"/>
+          <w:footerReference w:type="first" r:id="rId11"/>
           <w:pgSz w:w="12240" w:h="15840"/>
           <w:pgMar w:top="720" w:right="720" w:bottom="720" w:left="720" w:header="708" w:footer="708" w:gutter="0"/>
           <w:cols w:space="708"/>
@@ -657,6 +661,7 @@
               </w:rPr>
             </w:pPr>
             <w:bookmarkStart w:id="4" w:name="OLE_LINK8"/>
+            <w:proofErr w:type="gramStart"/>
             <w:r>
               <w:rPr>
                 <w:rStyle w:val="ui-provider"/>
@@ -673,7 +678,6 @@
               <w:t>PublicFeeSum</w:t>
             </w:r>
             <w:proofErr w:type="spellEnd"/>
-            <w:proofErr w:type="gramStart"/>
             <w:r>
               <w:rPr>
                 <w:rStyle w:val="ui-provider"/>
@@ -687,7 +691,7 @@
                 <w:rStyle w:val="ui-provider"/>
                 <w:sz w:val="22"/>
               </w:rPr>
-              <w:t>{</w:t>
+              <w:t>{{/</w:t>
             </w:r>
             <w:proofErr w:type="gramEnd"/>
             <w:r>
@@ -695,7 +699,7 @@
                 <w:rStyle w:val="ui-provider"/>
                 <w:sz w:val="22"/>
               </w:rPr>
-              <w:t>{/P</w:t>
+              <w:t>P</w:t>
             </w:r>
             <w:r>
               <w:rPr>
@@ -851,6 +855,7 @@
                 <w:sz w:val="22"/>
               </w:rPr>
             </w:pPr>
+            <w:proofErr w:type="gramStart"/>
             <w:r>
               <w:rPr>
                 <w:rStyle w:val="ui-provider"/>
@@ -871,7 +876,6 @@
               <w:t>PrivateFeeSum</w:t>
             </w:r>
             <w:proofErr w:type="spellEnd"/>
-            <w:proofErr w:type="gramStart"/>
             <w:r>
               <w:rPr>
                 <w:rStyle w:val="ui-provider"/>
@@ -889,7 +893,7 @@
                 <w:sz w:val="22"/>
                 <w14:ligatures w14:val="none"/>
               </w:rPr>
-              <w:t>{</w:t>
+              <w:t>{{/</w:t>
             </w:r>
             <w:proofErr w:type="gramEnd"/>
             <w:r>
@@ -899,7 +903,7 @@
                 <w:sz w:val="22"/>
                 <w14:ligatures w14:val="none"/>
               </w:rPr>
-              <w:t>{/Private}}</w:t>
+              <w:t>Private}}</w:t>
             </w:r>
             <w:bookmarkEnd w:id="8"/>
           </w:p>
@@ -933,16 +937,7 @@
                 <w:sz w:val="22"/>
                 <w14:ligatures w14:val="none"/>
               </w:rPr>
-              <w:t xml:space="preserve">Per </w:t>
-            </w:r>
-            <w:proofErr w:type="gramStart"/>
-            <w:r>
-              <w:rPr>
-                <w:kern w:val="0"/>
-                <w:sz w:val="22"/>
-                <w14:ligatures w14:val="none"/>
-              </w:rPr>
-              <w:t>Diem</w:t>
+              <w:t>Per Diem</w:t>
             </w:r>
             <w:bookmarkEnd w:id="9"/>
             <w:r>
@@ -952,17 +947,7 @@
                 <w:sz w:val="22"/>
                 <w14:ligatures w14:val="none"/>
               </w:rPr>
-              <w:t>{</w:t>
-            </w:r>
-            <w:proofErr w:type="gramEnd"/>
-            <w:r>
-              <w:rPr>
-                <w:rStyle w:val="ui-provider"/>
-                <w:kern w:val="0"/>
-                <w:sz w:val="22"/>
-                <w14:ligatures w14:val="none"/>
-              </w:rPr>
-              <w:t>{#</w:t>
+              <w:t>{{#</w:t>
             </w:r>
             <w:r>
               <w:rPr>
@@ -1121,7 +1106,6 @@
               </w:rPr>
               <w:t>{{</w:t>
             </w:r>
-            <w:proofErr w:type="spellStart"/>
             <w:r>
               <w:rPr>
                 <w:kern w:val="0"/>
@@ -1137,18 +1121,7 @@
                 <w:sz w:val="22"/>
                 <w14:ligatures w14:val="none"/>
               </w:rPr>
-              <w:t>Sum</w:t>
-            </w:r>
-            <w:proofErr w:type="spellEnd"/>
-            <w:proofErr w:type="gramStart"/>
-            <w:r>
-              <w:rPr>
-                <w:rStyle w:val="ui-provider"/>
-                <w:kern w:val="0"/>
-                <w:sz w:val="22"/>
-                <w14:ligatures w14:val="none"/>
-              </w:rPr>
-              <w:t>}}</w:t>
+              <w:t>Sum}}</w:t>
             </w:r>
             <w:bookmarkStart w:id="14" w:name="OLE_LINK29"/>
             <w:r>
@@ -1158,17 +1131,7 @@
                 <w:sz w:val="22"/>
                 <w14:ligatures w14:val="none"/>
               </w:rPr>
-              <w:t>{</w:t>
-            </w:r>
-            <w:proofErr w:type="gramEnd"/>
-            <w:r>
-              <w:rPr>
-                <w:rStyle w:val="ui-provider"/>
-                <w:kern w:val="0"/>
-                <w:sz w:val="22"/>
-                <w14:ligatures w14:val="none"/>
-              </w:rPr>
-              <w:t>{/</w:t>
+              <w:t>{{/</w:t>
             </w:r>
             <w:r>
               <w:rPr>
@@ -1794,7 +1757,7 @@
 </file>
 
 <file path=word/endnotes.xml><?xml version="1.0" encoding="utf-8"?>
-<w:endnotes xmlns:wpc="http://schemas.microsoft.com/office/word/2010/wordprocessingCanvas" xmlns:cx="http://schemas.microsoft.com/office/drawing/2014/chartex" xmlns:cx1="http://schemas.microsoft.com/office/drawing/2015/9/8/chartex" xmlns:cx2="http://schemas.microsoft.com/office/drawing/2015/10/21/chartex" xmlns:cx3="http://schemas.microsoft.com/office/drawing/2016/5/9/chartex" xmlns:cx4="http://schemas.microsoft.com/office/drawing/2016/5/10/chartex" xmlns:cx5="http://schemas.microsoft.com/office/drawing/2016/5/11/chartex" xmlns:cx6="http://schemas.microsoft.com/office/drawing/2016/5/12/chartex" xmlns:cx7="http://schemas.microsoft.com/office/drawing/2016/5/13/chartex" xmlns:cx8="http://schemas.microsoft.com/office/drawing/2016/5/14/chartex" xmlns:mc="http://schemas.openxmlformats.org/markup-compatibility/2006" xmlns:aink="http://schemas.microsoft.com/office/drawing/2016/ink" xmlns:am3d="http://schemas.microsoft.com/office/drawing/2017/model3d" xmlns:o="urn:schemas-microsoft-com:office:office" xmlns:oel="http://schemas.microsoft.com/office/2019/extlst" xmlns:r="http://schemas.openxmlformats.org/officeDocument/2006/relationships" xmlns:m="http://schemas.openxmlformats.org/officeDocument/2006/math" xmlns:v="urn:schemas-microsoft-com:vml" xmlns:wp14="http://schemas.microsoft.com/office/word/2010/wordprocessingDrawing" xmlns:wp="http://schemas.openxmlformats.org/drawingml/2006/wordprocessingDrawing" xmlns:w10="urn:schemas-microsoft-com:office:word" xmlns:w="http://schemas.openxmlformats.org/wordprocessingml/2006/main" xmlns:w14="http://schemas.microsoft.com/office/word/2010/wordml" xmlns:w15="http://schemas.microsoft.com/office/word/2012/wordml" xmlns:w16cex="http://schemas.microsoft.com/office/word/2018/wordml/cex" xmlns:w16cid="http://schemas.microsoft.com/office/word/2016/wordml/cid" xmlns:w16="http://schemas.microsoft.com/office/word/2018/wordml" xmlns:w16sdtdh="http://schemas.microsoft.com/office/word/2020/wordml/sdtdatahash" xmlns:w16se="http://schemas.microsoft.com/office/word/2015/wordml/symex" xmlns:wpg="http://schemas.microsoft.com/office/word/2010/wordprocessingGroup" xmlns:wpi="http://schemas.microsoft.com/office/word/2010/wordprocessingInk" xmlns:wne="http://schemas.microsoft.com/office/word/2006/wordml" xmlns:wps="http://schemas.microsoft.com/office/word/2010/wordprocessingShape" mc:Ignorable="w14 w15 w16se w16cid w16 w16cex w16sdtdh wp14">
+<w:endnotes xmlns:wpc="http://schemas.microsoft.com/office/word/2010/wordprocessingCanvas" xmlns:cx="http://schemas.microsoft.com/office/drawing/2014/chartex" xmlns:cx1="http://schemas.microsoft.com/office/drawing/2015/9/8/chartex" xmlns:cx2="http://schemas.microsoft.com/office/drawing/2015/10/21/chartex" xmlns:cx3="http://schemas.microsoft.com/office/drawing/2016/5/9/chartex" xmlns:cx4="http://schemas.microsoft.com/office/drawing/2016/5/10/chartex" xmlns:cx5="http://schemas.microsoft.com/office/drawing/2016/5/11/chartex" xmlns:cx6="http://schemas.microsoft.com/office/drawing/2016/5/12/chartex" xmlns:cx7="http://schemas.microsoft.com/office/drawing/2016/5/13/chartex" xmlns:cx8="http://schemas.microsoft.com/office/drawing/2016/5/14/chartex" xmlns:mc="http://schemas.openxmlformats.org/markup-compatibility/2006" xmlns:aink="http://schemas.microsoft.com/office/drawing/2016/ink" xmlns:am3d="http://schemas.microsoft.com/office/drawing/2017/model3d" xmlns:o="urn:schemas-microsoft-com:office:office" xmlns:oel="http://schemas.microsoft.com/office/2019/extlst" xmlns:r="http://schemas.openxmlformats.org/officeDocument/2006/relationships" xmlns:m="http://schemas.openxmlformats.org/officeDocument/2006/math" xmlns:v="urn:schemas-microsoft-com:vml" xmlns:wp14="http://schemas.microsoft.com/office/word/2010/wordprocessingDrawing" xmlns:wp="http://schemas.openxmlformats.org/drawingml/2006/wordprocessingDrawing" xmlns:w10="urn:schemas-microsoft-com:office:word" xmlns:w="http://schemas.openxmlformats.org/wordprocessingml/2006/main" xmlns:w14="http://schemas.microsoft.com/office/word/2010/wordml" xmlns:w15="http://schemas.microsoft.com/office/word/2012/wordml" xmlns:w16cex="http://schemas.microsoft.com/office/word/2018/wordml/cex" xmlns:w16cid="http://schemas.microsoft.com/office/word/2016/wordml/cid" xmlns:w16="http://schemas.microsoft.com/office/word/2018/wordml" xmlns:w16du="http://schemas.microsoft.com/office/word/2023/wordml/word16du" xmlns:w16sdtdh="http://schemas.microsoft.com/office/word/2020/wordml/sdtdatahash" xmlns:w16sdtfl="http://schemas.microsoft.com/office/word/2024/wordml/sdtformatlock" xmlns:w16se="http://schemas.microsoft.com/office/word/2015/wordml/symex" xmlns:wpg="http://schemas.microsoft.com/office/word/2010/wordprocessingGroup" xmlns:wpi="http://schemas.microsoft.com/office/word/2010/wordprocessingInk" xmlns:wne="http://schemas.microsoft.com/office/word/2006/wordml" xmlns:wps="http://schemas.microsoft.com/office/word/2010/wordprocessingShape" mc:Ignorable="w14 w15 w16se w16cid w16 w16cex w16sdtdh w16sdtfl w16du wp14">
   <w:endnote w:type="separator" w:id="-1">
     <w:p>
       <w:pPr>
@@ -1819,7 +1782,17 @@
 </file>
 
 <file path=word/footer1.xml><?xml version="1.0" encoding="utf-8"?>
-<w:ftr xmlns:wpc="http://schemas.microsoft.com/office/word/2010/wordprocessingCanvas" xmlns:cx="http://schemas.microsoft.com/office/drawing/2014/chartex" xmlns:cx1="http://schemas.microsoft.com/office/drawing/2015/9/8/chartex" xmlns:cx2="http://schemas.microsoft.com/office/drawing/2015/10/21/chartex" xmlns:cx3="http://schemas.microsoft.com/office/drawing/2016/5/9/chartex" xmlns:cx4="http://schemas.microsoft.com/office/drawing/2016/5/10/chartex" xmlns:cx5="http://schemas.microsoft.com/office/drawing/2016/5/11/chartex" xmlns:cx6="http://schemas.microsoft.com/office/drawing/2016/5/12/chartex" xmlns:cx7="http://schemas.microsoft.com/office/drawing/2016/5/13/chartex" xmlns:cx8="http://schemas.microsoft.com/office/drawing/2016/5/14/chartex" xmlns:mc="http://schemas.openxmlformats.org/markup-compatibility/2006" xmlns:aink="http://schemas.microsoft.com/office/drawing/2016/ink" xmlns:am3d="http://schemas.microsoft.com/office/drawing/2017/model3d" xmlns:o="urn:schemas-microsoft-com:office:office" xmlns:oel="http://schemas.microsoft.com/office/2019/extlst" xmlns:r="http://schemas.openxmlformats.org/officeDocument/2006/relationships" xmlns:m="http://schemas.openxmlformats.org/officeDocument/2006/math" xmlns:v="urn:schemas-microsoft-com:vml" xmlns:wp14="http://schemas.microsoft.com/office/word/2010/wordprocessingDrawing" xmlns:wp="http://schemas.openxmlformats.org/drawingml/2006/wordprocessingDrawing" xmlns:w10="urn:schemas-microsoft-com:office:word" xmlns:w="http://schemas.openxmlformats.org/wordprocessingml/2006/main" xmlns:w14="http://schemas.microsoft.com/office/word/2010/wordml" xmlns:w15="http://schemas.microsoft.com/office/word/2012/wordml" xmlns:w16cex="http://schemas.microsoft.com/office/word/2018/wordml/cex" xmlns:w16cid="http://schemas.microsoft.com/office/word/2016/wordml/cid" xmlns:w16="http://schemas.microsoft.com/office/word/2018/wordml" xmlns:w16sdtdh="http://schemas.microsoft.com/office/word/2020/wordml/sdtdatahash" xmlns:w16se="http://schemas.microsoft.com/office/word/2015/wordml/symex" xmlns:wpg="http://schemas.microsoft.com/office/word/2010/wordprocessingGroup" xmlns:wpi="http://schemas.microsoft.com/office/word/2010/wordprocessingInk" xmlns:wne="http://schemas.microsoft.com/office/word/2006/wordml" xmlns:wps="http://schemas.microsoft.com/office/word/2010/wordprocessingShape" mc:Ignorable="w14 w15 w16se w16cid w16 w16cex w16sdtdh wp14">
+<w:ftr xmlns:wpc="http://schemas.microsoft.com/office/word/2010/wordprocessingCanvas" xmlns:cx="http://schemas.microsoft.com/office/drawing/2014/chartex" xmlns:cx1="http://schemas.microsoft.com/office/drawing/2015/9/8/chartex" xmlns:cx2="http://schemas.microsoft.com/office/drawing/2015/10/21/chartex" xmlns:cx3="http://schemas.microsoft.com/office/drawing/2016/5/9/chartex" xmlns:cx4="http://schemas.microsoft.com/office/drawing/2016/5/10/chartex" xmlns:cx5="http://schemas.microsoft.com/office/drawing/2016/5/11/chartex" xmlns:cx6="http://schemas.microsoft.com/office/drawing/2016/5/12/chartex" xmlns:cx7="http://schemas.microsoft.com/office/drawing/2016/5/13/chartex" xmlns:cx8="http://schemas.microsoft.com/office/drawing/2016/5/14/chartex" xmlns:mc="http://schemas.openxmlformats.org/markup-compatibility/2006" xmlns:aink="http://schemas.microsoft.com/office/drawing/2016/ink" xmlns:am3d="http://schemas.microsoft.com/office/drawing/2017/model3d" xmlns:o="urn:schemas-microsoft-com:office:office" xmlns:oel="http://schemas.microsoft.com/office/2019/extlst" xmlns:r="http://schemas.openxmlformats.org/officeDocument/2006/relationships" xmlns:m="http://schemas.openxmlformats.org/officeDocument/2006/math" xmlns:v="urn:schemas-microsoft-com:vml" xmlns:wp14="http://schemas.microsoft.com/office/word/2010/wordprocessingDrawing" xmlns:wp="http://schemas.openxmlformats.org/drawingml/2006/wordprocessingDrawing" xmlns:w10="urn:schemas-microsoft-com:office:word" xmlns:w="http://schemas.openxmlformats.org/wordprocessingml/2006/main" xmlns:w14="http://schemas.microsoft.com/office/word/2010/wordml" xmlns:w15="http://schemas.microsoft.com/office/word/2012/wordml" xmlns:w16cex="http://schemas.microsoft.com/office/word/2018/wordml/cex" xmlns:w16cid="http://schemas.microsoft.com/office/word/2016/wordml/cid" xmlns:w16="http://schemas.microsoft.com/office/word/2018/wordml" xmlns:w16du="http://schemas.microsoft.com/office/word/2023/wordml/word16du" xmlns:w16sdtdh="http://schemas.microsoft.com/office/word/2020/wordml/sdtdatahash" xmlns:w16sdtfl="http://schemas.microsoft.com/office/word/2024/wordml/sdtformatlock" xmlns:w16se="http://schemas.microsoft.com/office/word/2015/wordml/symex" xmlns:wpg="http://schemas.microsoft.com/office/word/2010/wordprocessingGroup" xmlns:wpi="http://schemas.microsoft.com/office/word/2010/wordprocessingInk" xmlns:wne="http://schemas.microsoft.com/office/word/2006/wordml" xmlns:wps="http://schemas.microsoft.com/office/word/2010/wordprocessingShape" mc:Ignorable="w14 w15 w16se w16cid w16 w16cex w16sdtdh w16sdtfl w16du wp14">
+  <w:p>
+    <w:pPr>
+      <w:pStyle w:val="Footer"/>
+    </w:pPr>
+  </w:p>
+</w:ftr>
+</file>
+
+<file path=word/footer2.xml><?xml version="1.0" encoding="utf-8"?>
+<w:ftr xmlns:wpc="http://schemas.microsoft.com/office/word/2010/wordprocessingCanvas" xmlns:cx="http://schemas.microsoft.com/office/drawing/2014/chartex" xmlns:cx1="http://schemas.microsoft.com/office/drawing/2015/9/8/chartex" xmlns:cx2="http://schemas.microsoft.com/office/drawing/2015/10/21/chartex" xmlns:cx3="http://schemas.microsoft.com/office/drawing/2016/5/9/chartex" xmlns:cx4="http://schemas.microsoft.com/office/drawing/2016/5/10/chartex" xmlns:cx5="http://schemas.microsoft.com/office/drawing/2016/5/11/chartex" xmlns:cx6="http://schemas.microsoft.com/office/drawing/2016/5/12/chartex" xmlns:cx7="http://schemas.microsoft.com/office/drawing/2016/5/13/chartex" xmlns:cx8="http://schemas.microsoft.com/office/drawing/2016/5/14/chartex" xmlns:mc="http://schemas.openxmlformats.org/markup-compatibility/2006" xmlns:aink="http://schemas.microsoft.com/office/drawing/2016/ink" xmlns:am3d="http://schemas.microsoft.com/office/drawing/2017/model3d" xmlns:o="urn:schemas-microsoft-com:office:office" xmlns:oel="http://schemas.microsoft.com/office/2019/extlst" xmlns:r="http://schemas.openxmlformats.org/officeDocument/2006/relationships" xmlns:m="http://schemas.openxmlformats.org/officeDocument/2006/math" xmlns:v="urn:schemas-microsoft-com:vml" xmlns:wp14="http://schemas.microsoft.com/office/word/2010/wordprocessingDrawing" xmlns:wp="http://schemas.openxmlformats.org/drawingml/2006/wordprocessingDrawing" xmlns:w10="urn:schemas-microsoft-com:office:word" xmlns:w="http://schemas.openxmlformats.org/wordprocessingml/2006/main" xmlns:w14="http://schemas.microsoft.com/office/word/2010/wordml" xmlns:w15="http://schemas.microsoft.com/office/word/2012/wordml" xmlns:w16cex="http://schemas.microsoft.com/office/word/2018/wordml/cex" xmlns:w16cid="http://schemas.microsoft.com/office/word/2016/wordml/cid" xmlns:w16="http://schemas.microsoft.com/office/word/2018/wordml" xmlns:w16du="http://schemas.microsoft.com/office/word/2023/wordml/word16du" xmlns:w16sdtdh="http://schemas.microsoft.com/office/word/2020/wordml/sdtdatahash" xmlns:w16sdtfl="http://schemas.microsoft.com/office/word/2024/wordml/sdtformatlock" xmlns:w16se="http://schemas.microsoft.com/office/word/2015/wordml/symex" xmlns:wpg="http://schemas.microsoft.com/office/word/2010/wordprocessingGroup" xmlns:wpi="http://schemas.microsoft.com/office/word/2010/wordprocessingInk" xmlns:wne="http://schemas.microsoft.com/office/word/2006/wordml" xmlns:wps="http://schemas.microsoft.com/office/word/2010/wordprocessingShape" mc:Ignorable="w14 w15 w16se w16cid w16 w16cex w16sdtdh w16sdtfl w16du wp14">
   <w:p>
     <w:pPr>
       <w:jc w:val="right"/>
@@ -1930,8 +1903,18 @@
 </w:ftr>
 </file>
 
+<file path=word/footer3.xml><?xml version="1.0" encoding="utf-8"?>
+<w:ftr xmlns:wpc="http://schemas.microsoft.com/office/word/2010/wordprocessingCanvas" xmlns:cx="http://schemas.microsoft.com/office/drawing/2014/chartex" xmlns:cx1="http://schemas.microsoft.com/office/drawing/2015/9/8/chartex" xmlns:cx2="http://schemas.microsoft.com/office/drawing/2015/10/21/chartex" xmlns:cx3="http://schemas.microsoft.com/office/drawing/2016/5/9/chartex" xmlns:cx4="http://schemas.microsoft.com/office/drawing/2016/5/10/chartex" xmlns:cx5="http://schemas.microsoft.com/office/drawing/2016/5/11/chartex" xmlns:cx6="http://schemas.microsoft.com/office/drawing/2016/5/12/chartex" xmlns:cx7="http://schemas.microsoft.com/office/drawing/2016/5/13/chartex" xmlns:cx8="http://schemas.microsoft.com/office/drawing/2016/5/14/chartex" xmlns:mc="http://schemas.openxmlformats.org/markup-compatibility/2006" xmlns:aink="http://schemas.microsoft.com/office/drawing/2016/ink" xmlns:am3d="http://schemas.microsoft.com/office/drawing/2017/model3d" xmlns:o="urn:schemas-microsoft-com:office:office" xmlns:oel="http://schemas.microsoft.com/office/2019/extlst" xmlns:r="http://schemas.openxmlformats.org/officeDocument/2006/relationships" xmlns:m="http://schemas.openxmlformats.org/officeDocument/2006/math" xmlns:v="urn:schemas-microsoft-com:vml" xmlns:wp14="http://schemas.microsoft.com/office/word/2010/wordprocessingDrawing" xmlns:wp="http://schemas.openxmlformats.org/drawingml/2006/wordprocessingDrawing" xmlns:w10="urn:schemas-microsoft-com:office:word" xmlns:w="http://schemas.openxmlformats.org/wordprocessingml/2006/main" xmlns:w14="http://schemas.microsoft.com/office/word/2010/wordml" xmlns:w15="http://schemas.microsoft.com/office/word/2012/wordml" xmlns:w16cex="http://schemas.microsoft.com/office/word/2018/wordml/cex" xmlns:w16cid="http://schemas.microsoft.com/office/word/2016/wordml/cid" xmlns:w16="http://schemas.microsoft.com/office/word/2018/wordml" xmlns:w16du="http://schemas.microsoft.com/office/word/2023/wordml/word16du" xmlns:w16sdtdh="http://schemas.microsoft.com/office/word/2020/wordml/sdtdatahash" xmlns:w16sdtfl="http://schemas.microsoft.com/office/word/2024/wordml/sdtformatlock" xmlns:w16se="http://schemas.microsoft.com/office/word/2015/wordml/symex" xmlns:wpg="http://schemas.microsoft.com/office/word/2010/wordprocessingGroup" xmlns:wpi="http://schemas.microsoft.com/office/word/2010/wordprocessingInk" xmlns:wne="http://schemas.microsoft.com/office/word/2006/wordml" xmlns:wps="http://schemas.microsoft.com/office/word/2010/wordprocessingShape" mc:Ignorable="w14 w15 w16se w16cid w16 w16cex w16sdtdh w16sdtfl w16du wp14">
+  <w:p>
+    <w:pPr>
+      <w:pStyle w:val="Footer"/>
+    </w:pPr>
+  </w:p>
+</w:ftr>
+</file>
+
 <file path=word/footnotes.xml><?xml version="1.0" encoding="utf-8"?>
-<w:footnotes xmlns:wpc="http://schemas.microsoft.com/office/word/2010/wordprocessingCanvas" xmlns:cx="http://schemas.microsoft.com/office/drawing/2014/chartex" xmlns:cx1="http://schemas.microsoft.com/office/drawing/2015/9/8/chartex" xmlns:cx2="http://schemas.microsoft.com/office/drawing/2015/10/21/chartex" xmlns:cx3="http://schemas.microsoft.com/office/drawing/2016/5/9/chartex" xmlns:cx4="http://schemas.microsoft.com/office/drawing/2016/5/10/chartex" xmlns:cx5="http://schemas.microsoft.com/office/drawing/2016/5/11/chartex" xmlns:cx6="http://schemas.microsoft.com/office/drawing/2016/5/12/chartex" xmlns:cx7="http://schemas.microsoft.com/office/drawing/2016/5/13/chartex" xmlns:cx8="http://schemas.microsoft.com/office/drawing/2016/5/14/chartex" xmlns:mc="http://schemas.openxmlformats.org/markup-compatibility/2006" xmlns:aink="http://schemas.microsoft.com/office/drawing/2016/ink" xmlns:am3d="http://schemas.microsoft.com/office/drawing/2017/model3d" xmlns:o="urn:schemas-microsoft-com:office:office" xmlns:oel="http://schemas.microsoft.com/office/2019/extlst" xmlns:r="http://schemas.openxmlformats.org/officeDocument/2006/relationships" xmlns:m="http://schemas.openxmlformats.org/officeDocument/2006/math" xmlns:v="urn:schemas-microsoft-com:vml" xmlns:wp14="http://schemas.microsoft.com/office/word/2010/wordprocessingDrawing" xmlns:wp="http://schemas.openxmlformats.org/drawingml/2006/wordprocessingDrawing" xmlns:w10="urn:schemas-microsoft-com:office:word" xmlns:w="http://schemas.openxmlformats.org/wordprocessingml/2006/main" xmlns:w14="http://schemas.microsoft.com/office/word/2010/wordml" xmlns:w15="http://schemas.microsoft.com/office/word/2012/wordml" xmlns:w16cex="http://schemas.microsoft.com/office/word/2018/wordml/cex" xmlns:w16cid="http://schemas.microsoft.com/office/word/2016/wordml/cid" xmlns:w16="http://schemas.microsoft.com/office/word/2018/wordml" xmlns:w16sdtdh="http://schemas.microsoft.com/office/word/2020/wordml/sdtdatahash" xmlns:w16se="http://schemas.microsoft.com/office/word/2015/wordml/symex" xmlns:wpg="http://schemas.microsoft.com/office/word/2010/wordprocessingGroup" xmlns:wpi="http://schemas.microsoft.com/office/word/2010/wordprocessingInk" xmlns:wne="http://schemas.microsoft.com/office/word/2006/wordml" xmlns:wps="http://schemas.microsoft.com/office/word/2010/wordprocessingShape" mc:Ignorable="w14 w15 w16se w16cid w16 w16cex w16sdtdh wp14">
+<w:footnotes xmlns:wpc="http://schemas.microsoft.com/office/word/2010/wordprocessingCanvas" xmlns:cx="http://schemas.microsoft.com/office/drawing/2014/chartex" xmlns:cx1="http://schemas.microsoft.com/office/drawing/2015/9/8/chartex" xmlns:cx2="http://schemas.microsoft.com/office/drawing/2015/10/21/chartex" xmlns:cx3="http://schemas.microsoft.com/office/drawing/2016/5/9/chartex" xmlns:cx4="http://schemas.microsoft.com/office/drawing/2016/5/10/chartex" xmlns:cx5="http://schemas.microsoft.com/office/drawing/2016/5/11/chartex" xmlns:cx6="http://schemas.microsoft.com/office/drawing/2016/5/12/chartex" xmlns:cx7="http://schemas.microsoft.com/office/drawing/2016/5/13/chartex" xmlns:cx8="http://schemas.microsoft.com/office/drawing/2016/5/14/chartex" xmlns:mc="http://schemas.openxmlformats.org/markup-compatibility/2006" xmlns:aink="http://schemas.microsoft.com/office/drawing/2016/ink" xmlns:am3d="http://schemas.microsoft.com/office/drawing/2017/model3d" xmlns:o="urn:schemas-microsoft-com:office:office" xmlns:oel="http://schemas.microsoft.com/office/2019/extlst" xmlns:r="http://schemas.openxmlformats.org/officeDocument/2006/relationships" xmlns:m="http://schemas.openxmlformats.org/officeDocument/2006/math" xmlns:v="urn:schemas-microsoft-com:vml" xmlns:wp14="http://schemas.microsoft.com/office/word/2010/wordprocessingDrawing" xmlns:wp="http://schemas.openxmlformats.org/drawingml/2006/wordprocessingDrawing" xmlns:w10="urn:schemas-microsoft-com:office:word" xmlns:w="http://schemas.openxmlformats.org/wordprocessingml/2006/main" xmlns:w14="http://schemas.microsoft.com/office/word/2010/wordml" xmlns:w15="http://schemas.microsoft.com/office/word/2012/wordml" xmlns:w16cex="http://schemas.microsoft.com/office/word/2018/wordml/cex" xmlns:w16cid="http://schemas.microsoft.com/office/word/2016/wordml/cid" xmlns:w16="http://schemas.microsoft.com/office/word/2018/wordml" xmlns:w16du="http://schemas.microsoft.com/office/word/2023/wordml/word16du" xmlns:w16sdtdh="http://schemas.microsoft.com/office/word/2020/wordml/sdtdatahash" xmlns:w16sdtfl="http://schemas.microsoft.com/office/word/2024/wordml/sdtformatlock" xmlns:w16se="http://schemas.microsoft.com/office/word/2015/wordml/symex" xmlns:wpg="http://schemas.microsoft.com/office/word/2010/wordprocessingGroup" xmlns:wpi="http://schemas.microsoft.com/office/word/2010/wordprocessingInk" xmlns:wne="http://schemas.microsoft.com/office/word/2006/wordml" xmlns:wps="http://schemas.microsoft.com/office/word/2010/wordprocessingShape" mc:Ignorable="w14 w15 w16se w16cid w16 w16cex w16sdtdh w16sdtfl w16du wp14">
   <w:footnote w:type="separator" w:id="-1">
     <w:p>
       <w:pPr>
@@ -1956,7 +1939,17 @@
 </file>
 
 <file path=word/header1.xml><?xml version="1.0" encoding="utf-8"?>
-<w:hdr xmlns:wpc="http://schemas.microsoft.com/office/word/2010/wordprocessingCanvas" xmlns:cx="http://schemas.microsoft.com/office/drawing/2014/chartex" xmlns:cx1="http://schemas.microsoft.com/office/drawing/2015/9/8/chartex" xmlns:cx2="http://schemas.microsoft.com/office/drawing/2015/10/21/chartex" xmlns:cx3="http://schemas.microsoft.com/office/drawing/2016/5/9/chartex" xmlns:cx4="http://schemas.microsoft.com/office/drawing/2016/5/10/chartex" xmlns:cx5="http://schemas.microsoft.com/office/drawing/2016/5/11/chartex" xmlns:cx6="http://schemas.microsoft.com/office/drawing/2016/5/12/chartex" xmlns:cx7="http://schemas.microsoft.com/office/drawing/2016/5/13/chartex" xmlns:cx8="http://schemas.microsoft.com/office/drawing/2016/5/14/chartex" xmlns:mc="http://schemas.openxmlformats.org/markup-compatibility/2006" xmlns:aink="http://schemas.microsoft.com/office/drawing/2016/ink" xmlns:am3d="http://schemas.microsoft.com/office/drawing/2017/model3d" xmlns:o="urn:schemas-microsoft-com:office:office" xmlns:oel="http://schemas.microsoft.com/office/2019/extlst" xmlns:r="http://schemas.openxmlformats.org/officeDocument/2006/relationships" xmlns:m="http://schemas.openxmlformats.org/officeDocument/2006/math" xmlns:v="urn:schemas-microsoft-com:vml" xmlns:wp14="http://schemas.microsoft.com/office/word/2010/wordprocessingDrawing" xmlns:wp="http://schemas.openxmlformats.org/drawingml/2006/wordprocessingDrawing" xmlns:w10="urn:schemas-microsoft-com:office:word" xmlns:w="http://schemas.openxmlformats.org/wordprocessingml/2006/main" xmlns:w14="http://schemas.microsoft.com/office/word/2010/wordml" xmlns:w15="http://schemas.microsoft.com/office/word/2012/wordml" xmlns:w16cex="http://schemas.microsoft.com/office/word/2018/wordml/cex" xmlns:w16cid="http://schemas.microsoft.com/office/word/2016/wordml/cid" xmlns:w16="http://schemas.microsoft.com/office/word/2018/wordml" xmlns:w16sdtdh="http://schemas.microsoft.com/office/word/2020/wordml/sdtdatahash" xmlns:w16se="http://schemas.microsoft.com/office/word/2015/wordml/symex" xmlns:wpg="http://schemas.microsoft.com/office/word/2010/wordprocessingGroup" xmlns:wpi="http://schemas.microsoft.com/office/word/2010/wordprocessingInk" xmlns:wne="http://schemas.microsoft.com/office/word/2006/wordml" xmlns:wps="http://schemas.microsoft.com/office/word/2010/wordprocessingShape" mc:Ignorable="w14 w15 w16se w16cid w16 w16cex w16sdtdh wp14">
+<w:hdr xmlns:wpc="http://schemas.microsoft.com/office/word/2010/wordprocessingCanvas" xmlns:cx="http://schemas.microsoft.com/office/drawing/2014/chartex" xmlns:cx1="http://schemas.microsoft.com/office/drawing/2015/9/8/chartex" xmlns:cx2="http://schemas.microsoft.com/office/drawing/2015/10/21/chartex" xmlns:cx3="http://schemas.microsoft.com/office/drawing/2016/5/9/chartex" xmlns:cx4="http://schemas.microsoft.com/office/drawing/2016/5/10/chartex" xmlns:cx5="http://schemas.microsoft.com/office/drawing/2016/5/11/chartex" xmlns:cx6="http://schemas.microsoft.com/office/drawing/2016/5/12/chartex" xmlns:cx7="http://schemas.microsoft.com/office/drawing/2016/5/13/chartex" xmlns:cx8="http://schemas.microsoft.com/office/drawing/2016/5/14/chartex" xmlns:mc="http://schemas.openxmlformats.org/markup-compatibility/2006" xmlns:aink="http://schemas.microsoft.com/office/drawing/2016/ink" xmlns:am3d="http://schemas.microsoft.com/office/drawing/2017/model3d" xmlns:o="urn:schemas-microsoft-com:office:office" xmlns:oel="http://schemas.microsoft.com/office/2019/extlst" xmlns:r="http://schemas.openxmlformats.org/officeDocument/2006/relationships" xmlns:m="http://schemas.openxmlformats.org/officeDocument/2006/math" xmlns:v="urn:schemas-microsoft-com:vml" xmlns:wp14="http://schemas.microsoft.com/office/word/2010/wordprocessingDrawing" xmlns:wp="http://schemas.openxmlformats.org/drawingml/2006/wordprocessingDrawing" xmlns:w10="urn:schemas-microsoft-com:office:word" xmlns:w="http://schemas.openxmlformats.org/wordprocessingml/2006/main" xmlns:w14="http://schemas.microsoft.com/office/word/2010/wordml" xmlns:w15="http://schemas.microsoft.com/office/word/2012/wordml" xmlns:w16cex="http://schemas.microsoft.com/office/word/2018/wordml/cex" xmlns:w16cid="http://schemas.microsoft.com/office/word/2016/wordml/cid" xmlns:w16="http://schemas.microsoft.com/office/word/2018/wordml" xmlns:w16du="http://schemas.microsoft.com/office/word/2023/wordml/word16du" xmlns:w16sdtdh="http://schemas.microsoft.com/office/word/2020/wordml/sdtdatahash" xmlns:w16sdtfl="http://schemas.microsoft.com/office/word/2024/wordml/sdtformatlock" xmlns:w16se="http://schemas.microsoft.com/office/word/2015/wordml/symex" xmlns:wpg="http://schemas.microsoft.com/office/word/2010/wordprocessingGroup" xmlns:wpi="http://schemas.microsoft.com/office/word/2010/wordprocessingInk" xmlns:wne="http://schemas.microsoft.com/office/word/2006/wordml" xmlns:wps="http://schemas.microsoft.com/office/word/2010/wordprocessingShape" mc:Ignorable="w14 w15 w16se w16cid w16 w16cex w16sdtdh w16sdtfl w16du wp14">
+  <w:p>
+    <w:pPr>
+      <w:pStyle w:val="Header"/>
+    </w:pPr>
+  </w:p>
+</w:hdr>
+</file>
+
+<file path=word/header2.xml><?xml version="1.0" encoding="utf-8"?>
+<w:hdr xmlns:wpc="http://schemas.microsoft.com/office/word/2010/wordprocessingCanvas" xmlns:cx="http://schemas.microsoft.com/office/drawing/2014/chartex" xmlns:cx1="http://schemas.microsoft.com/office/drawing/2015/9/8/chartex" xmlns:cx2="http://schemas.microsoft.com/office/drawing/2015/10/21/chartex" xmlns:cx3="http://schemas.microsoft.com/office/drawing/2016/5/9/chartex" xmlns:cx4="http://schemas.microsoft.com/office/drawing/2016/5/10/chartex" xmlns:cx5="http://schemas.microsoft.com/office/drawing/2016/5/11/chartex" xmlns:cx6="http://schemas.microsoft.com/office/drawing/2016/5/12/chartex" xmlns:cx7="http://schemas.microsoft.com/office/drawing/2016/5/13/chartex" xmlns:cx8="http://schemas.microsoft.com/office/drawing/2016/5/14/chartex" xmlns:mc="http://schemas.openxmlformats.org/markup-compatibility/2006" xmlns:aink="http://schemas.microsoft.com/office/drawing/2016/ink" xmlns:am3d="http://schemas.microsoft.com/office/drawing/2017/model3d" xmlns:o="urn:schemas-microsoft-com:office:office" xmlns:oel="http://schemas.microsoft.com/office/2019/extlst" xmlns:r="http://schemas.openxmlformats.org/officeDocument/2006/relationships" xmlns:m="http://schemas.openxmlformats.org/officeDocument/2006/math" xmlns:v="urn:schemas-microsoft-com:vml" xmlns:wp14="http://schemas.microsoft.com/office/word/2010/wordprocessingDrawing" xmlns:wp="http://schemas.openxmlformats.org/drawingml/2006/wordprocessingDrawing" xmlns:w10="urn:schemas-microsoft-com:office:word" xmlns:w="http://schemas.openxmlformats.org/wordprocessingml/2006/main" xmlns:w14="http://schemas.microsoft.com/office/word/2010/wordml" xmlns:w15="http://schemas.microsoft.com/office/word/2012/wordml" xmlns:w16cex="http://schemas.microsoft.com/office/word/2018/wordml/cex" xmlns:w16cid="http://schemas.microsoft.com/office/word/2016/wordml/cid" xmlns:w16="http://schemas.microsoft.com/office/word/2018/wordml" xmlns:w16du="http://schemas.microsoft.com/office/word/2023/wordml/word16du" xmlns:w16sdtdh="http://schemas.microsoft.com/office/word/2020/wordml/sdtdatahash" xmlns:w16sdtfl="http://schemas.microsoft.com/office/word/2024/wordml/sdtformatlock" xmlns:w16se="http://schemas.microsoft.com/office/word/2015/wordml/symex" xmlns:wpg="http://schemas.microsoft.com/office/word/2010/wordprocessingGroup" xmlns:wpi="http://schemas.microsoft.com/office/word/2010/wordprocessingInk" xmlns:wne="http://schemas.microsoft.com/office/word/2006/wordml" xmlns:wps="http://schemas.microsoft.com/office/word/2010/wordprocessingShape" mc:Ignorable="w14 w15 w16se w16cid w16 w16cex w16sdtdh w16sdtfl w16du wp14">
   <w:p>
     <w:pPr>
       <w:rPr>
@@ -2094,65 +2087,57 @@
         <w:b/>
         <w:bCs/>
         <w:noProof/>
-        <w:sz w:val="22"/>
-      </w:rPr>
-      <w:t xml:space="preserve">        </w:t>
+        <w:sz w:val="28"/>
+        <w:szCs w:val="28"/>
+      </w:rPr>
+      <w:t xml:space="preserve">     </w:t>
     </w:r>
     <w:bookmarkStart w:id="0" w:name="OLE_LINK2"/>
     <w:r>
       <w:rPr>
         <w:b/>
         <w:bCs/>
-        <w:sz w:val="30"/>
-        <w:szCs w:val="30"/>
-      </w:rPr>
-      <w:t xml:space="preserve">Invoice </w:t>
+        <w:sz w:val="28"/>
+        <w:szCs w:val="28"/>
+      </w:rPr>
+      <w:t>Invoice #:</w:t>
     </w:r>
     <w:r>
       <w:rPr>
         <w:b/>
         <w:bCs/>
-        <w:sz w:val="30"/>
-        <w:szCs w:val="32"/>
-      </w:rPr>
-      <w:t>#:</w:t>
-    </w:r>
+        <w:sz w:val="28"/>
+        <w:szCs w:val="28"/>
+      </w:rPr>
+      <w:t xml:space="preserve"> </w:t>
+    </w:r>
+    <w:bookmarkEnd w:id="0"/>
     <w:r>
       <w:rPr>
         <w:b/>
         <w:bCs/>
-        <w:sz w:val="30"/>
-        <w:szCs w:val="32"/>
-      </w:rPr>
-      <w:t xml:space="preserve"> </w:t>
-    </w:r>
-    <w:bookmarkEnd w:id="0"/>
+        <w:sz w:val="28"/>
+        <w:szCs w:val="28"/>
+      </w:rPr>
+      <w:t>{{</w:t>
+    </w:r>
+    <w:proofErr w:type="spellStart"/>
     <w:r>
       <w:rPr>
         <w:b/>
         <w:bCs/>
-        <w:sz w:val="30"/>
-        <w:szCs w:val="30"/>
-      </w:rPr>
-      <w:t>{{</w:t>
-    </w:r>
-    <w:proofErr w:type="spellStart"/>
+        <w:sz w:val="28"/>
+        <w:szCs w:val="28"/>
+      </w:rPr>
+      <w:t>InvoiceId</w:t>
+    </w:r>
+    <w:proofErr w:type="spellEnd"/>
     <w:r>
       <w:rPr>
         <w:b/>
         <w:bCs/>
-        <w:sz w:val="30"/>
-        <w:szCs w:val="30"/>
-      </w:rPr>
-      <w:t>InvoiceId</w:t>
-    </w:r>
-    <w:proofErr w:type="spellEnd"/>
-    <w:r>
-      <w:rPr>
-        <w:b/>
-        <w:bCs/>
-        <w:sz w:val="30"/>
-        <w:szCs w:val="30"/>
+        <w:sz w:val="28"/>
+        <w:szCs w:val="28"/>
       </w:rPr>
       <w:t>}}</w:t>
     </w:r>
@@ -2201,15 +2186,6 @@
         <w:sz w:val="22"/>
       </w:rPr>
       <w:t xml:space="preserve">  </w:t>
-    </w:r>
-    <w:r>
-      <w:rPr>
-        <w:i/>
-        <w:iCs/>
-        <w:noProof/>
-        <w:sz w:val="22"/>
-      </w:rPr>
-      <w:t xml:space="preserve">   </w:t>
     </w:r>
     <w:r>
       <w:rPr>
@@ -2320,8 +2296,18 @@
 </w:hdr>
 </file>
 
+<file path=word/header3.xml><?xml version="1.0" encoding="utf-8"?>
+<w:hdr xmlns:wpc="http://schemas.microsoft.com/office/word/2010/wordprocessingCanvas" xmlns:cx="http://schemas.microsoft.com/office/drawing/2014/chartex" xmlns:cx1="http://schemas.microsoft.com/office/drawing/2015/9/8/chartex" xmlns:cx2="http://schemas.microsoft.com/office/drawing/2015/10/21/chartex" xmlns:cx3="http://schemas.microsoft.com/office/drawing/2016/5/9/chartex" xmlns:cx4="http://schemas.microsoft.com/office/drawing/2016/5/10/chartex" xmlns:cx5="http://schemas.microsoft.com/office/drawing/2016/5/11/chartex" xmlns:cx6="http://schemas.microsoft.com/office/drawing/2016/5/12/chartex" xmlns:cx7="http://schemas.microsoft.com/office/drawing/2016/5/13/chartex" xmlns:cx8="http://schemas.microsoft.com/office/drawing/2016/5/14/chartex" xmlns:mc="http://schemas.openxmlformats.org/markup-compatibility/2006" xmlns:aink="http://schemas.microsoft.com/office/drawing/2016/ink" xmlns:am3d="http://schemas.microsoft.com/office/drawing/2017/model3d" xmlns:o="urn:schemas-microsoft-com:office:office" xmlns:oel="http://schemas.microsoft.com/office/2019/extlst" xmlns:r="http://schemas.openxmlformats.org/officeDocument/2006/relationships" xmlns:m="http://schemas.openxmlformats.org/officeDocument/2006/math" xmlns:v="urn:schemas-microsoft-com:vml" xmlns:wp14="http://schemas.microsoft.com/office/word/2010/wordprocessingDrawing" xmlns:wp="http://schemas.openxmlformats.org/drawingml/2006/wordprocessingDrawing" xmlns:w10="urn:schemas-microsoft-com:office:word" xmlns:w="http://schemas.openxmlformats.org/wordprocessingml/2006/main" xmlns:w14="http://schemas.microsoft.com/office/word/2010/wordml" xmlns:w15="http://schemas.microsoft.com/office/word/2012/wordml" xmlns:w16cex="http://schemas.microsoft.com/office/word/2018/wordml/cex" xmlns:w16cid="http://schemas.microsoft.com/office/word/2016/wordml/cid" xmlns:w16="http://schemas.microsoft.com/office/word/2018/wordml" xmlns:w16du="http://schemas.microsoft.com/office/word/2023/wordml/word16du" xmlns:w16sdtdh="http://schemas.microsoft.com/office/word/2020/wordml/sdtdatahash" xmlns:w16sdtfl="http://schemas.microsoft.com/office/word/2024/wordml/sdtformatlock" xmlns:w16se="http://schemas.microsoft.com/office/word/2015/wordml/symex" xmlns:wpg="http://schemas.microsoft.com/office/word/2010/wordprocessingGroup" xmlns:wpi="http://schemas.microsoft.com/office/word/2010/wordprocessingInk" xmlns:wne="http://schemas.microsoft.com/office/word/2006/wordml" xmlns:wps="http://schemas.microsoft.com/office/word/2010/wordprocessingShape" mc:Ignorable="w14 w15 w16se w16cid w16 w16cex w16sdtdh w16sdtfl w16du wp14">
+  <w:p>
+    <w:pPr>
+      <w:pStyle w:val="Header"/>
+    </w:pPr>
+  </w:p>
+</w:hdr>
+</file>
+
 <file path=word/styles.xml><?xml version="1.0" encoding="utf-8"?>
-<w:styles xmlns:mc="http://schemas.openxmlformats.org/markup-compatibility/2006" xmlns:r="http://schemas.openxmlformats.org/officeDocument/2006/relationships" xmlns:w="http://schemas.openxmlformats.org/wordprocessingml/2006/main" xmlns:w14="http://schemas.microsoft.com/office/word/2010/wordml" xmlns:w15="http://schemas.microsoft.com/office/word/2012/wordml" xmlns:w16cex="http://schemas.microsoft.com/office/word/2018/wordml/cex" xmlns:w16cid="http://schemas.microsoft.com/office/word/2016/wordml/cid" xmlns:w16="http://schemas.microsoft.com/office/word/2018/wordml" xmlns:w16sdtdh="http://schemas.microsoft.com/office/word/2020/wordml/sdtdatahash" xmlns:w16se="http://schemas.microsoft.com/office/word/2015/wordml/symex" mc:Ignorable="w14 w15 w16se w16cid w16 w16cex w16sdtdh">
+<w:styles xmlns:mc="http://schemas.openxmlformats.org/markup-compatibility/2006" xmlns:r="http://schemas.openxmlformats.org/officeDocument/2006/relationships" xmlns:w="http://schemas.openxmlformats.org/wordprocessingml/2006/main" xmlns:w14="http://schemas.microsoft.com/office/word/2010/wordml" xmlns:w15="http://schemas.microsoft.com/office/word/2012/wordml" xmlns:w16cex="http://schemas.microsoft.com/office/word/2018/wordml/cex" xmlns:w16cid="http://schemas.microsoft.com/office/word/2016/wordml/cid" xmlns:w16="http://schemas.microsoft.com/office/word/2018/wordml" xmlns:w16du="http://schemas.microsoft.com/office/word/2023/wordml/word16du" xmlns:w16sdtdh="http://schemas.microsoft.com/office/word/2020/wordml/sdtdatahash" xmlns:w16sdtfl="http://schemas.microsoft.com/office/word/2024/wordml/sdtformatlock" xmlns:w16se="http://schemas.microsoft.com/office/word/2015/wordml/symex" mc:Ignorable="w14 w15 w16se w16cid w16 w16cex w16sdtdh w16sdtfl w16du">
   <w:docDefaults>
     <w:rPrDefault>
       <w:rPr>
@@ -3138,6 +3124,7 @@
 
 <file path=docMetadata/LabelInfo.xml><?xml version="1.0" encoding="utf-8"?>
 <clbl:labelList xmlns:clbl="http://schemas.microsoft.com/office/2020/mipLabelMetadata">
+  <clbl:label id="{d9290083-bd2f-48a2-8ac5-09a524b17d15}" enabled="1" method="Privileged" siteId="{b9fec68c-c92d-461e-9a97-3d03a0f18b82}" contentBits="1" removed="0"/>
   <clbl:label id="{e0793d39-0939-496d-b129-198edd916feb}" enabled="0" method="" siteId="{e0793d39-0939-496d-b129-198edd916feb}" removed="1"/>
 </clbl:labelList>
 </file>
</xml_diff>

<commit_message>
EHIS-3009 Registration field update for Invoice Template ALR
</commit_message>
<xml_diff>
--- a/ALR-DocgenTemplates/InvoiceTemplate.docx
+++ b/ALR-DocgenTemplates/InvoiceTemplate.docx
@@ -12,12 +12,8 @@
           <w:szCs w:val="34"/>
         </w:rPr>
         <w:sectPr>
-          <w:headerReference w:type="even" r:id="rId6"/>
-          <w:headerReference w:type="default" r:id="rId7"/>
-          <w:footerReference w:type="even" r:id="rId8"/>
-          <w:footerReference w:type="default" r:id="rId9"/>
-          <w:headerReference w:type="first" r:id="rId10"/>
-          <w:footerReference w:type="first" r:id="rId11"/>
+          <w:headerReference w:type="default" r:id="rId6"/>
+          <w:footerReference w:type="default" r:id="rId7"/>
           <w:pgSz w:w="12240" w:h="15840"/>
           <w:pgMar w:top="720" w:right="720" w:bottom="720" w:left="720" w:header="708" w:footer="708" w:gutter="0"/>
           <w:cols w:space="708"/>
@@ -661,28 +657,28 @@
               </w:rPr>
             </w:pPr>
             <w:bookmarkStart w:id="4" w:name="OLE_LINK8"/>
+            <w:r>
+              <w:rPr>
+                <w:rStyle w:val="ui-provider"/>
+                <w:sz w:val="22"/>
+              </w:rPr>
+              <w:t>{{</w:t>
+            </w:r>
+            <w:proofErr w:type="spellStart"/>
+            <w:r>
+              <w:rPr>
+                <w:rStyle w:val="ui-provider"/>
+                <w:sz w:val="22"/>
+              </w:rPr>
+              <w:t>PublicFeeSum</w:t>
+            </w:r>
+            <w:proofErr w:type="spellEnd"/>
             <w:proofErr w:type="gramStart"/>
             <w:r>
               <w:rPr>
                 <w:rStyle w:val="ui-provider"/>
                 <w:sz w:val="22"/>
               </w:rPr>
-              <w:t>{{</w:t>
-            </w:r>
-            <w:proofErr w:type="spellStart"/>
-            <w:r>
-              <w:rPr>
-                <w:rStyle w:val="ui-provider"/>
-                <w:sz w:val="22"/>
-              </w:rPr>
-              <w:t>PublicFeeSum</w:t>
-            </w:r>
-            <w:proofErr w:type="spellEnd"/>
-            <w:r>
-              <w:rPr>
-                <w:rStyle w:val="ui-provider"/>
-                <w:sz w:val="22"/>
-              </w:rPr>
               <w:t>}}</w:t>
             </w:r>
             <w:bookmarkStart w:id="5" w:name="OLE_LINK27"/>
@@ -691,7 +687,7 @@
                 <w:rStyle w:val="ui-provider"/>
                 <w:sz w:val="22"/>
               </w:rPr>
-              <w:t>{{/</w:t>
+              <w:t>{</w:t>
             </w:r>
             <w:proofErr w:type="gramEnd"/>
             <w:r>
@@ -699,7 +695,7 @@
                 <w:rStyle w:val="ui-provider"/>
                 <w:sz w:val="22"/>
               </w:rPr>
-              <w:t>P</w:t>
+              <w:t>{/P</w:t>
             </w:r>
             <w:r>
               <w:rPr>
@@ -855,6 +851,26 @@
                 <w:sz w:val="22"/>
               </w:rPr>
             </w:pPr>
+            <w:r>
+              <w:rPr>
+                <w:rStyle w:val="ui-provider"/>
+                <w:kern w:val="0"/>
+                <w:sz w:val="22"/>
+                <w14:ligatures w14:val="none"/>
+              </w:rPr>
+              <w:t>{{</w:t>
+            </w:r>
+            <w:proofErr w:type="spellStart"/>
+            <w:r>
+              <w:rPr>
+                <w:rStyle w:val="ui-provider"/>
+                <w:kern w:val="0"/>
+                <w:sz w:val="22"/>
+                <w14:ligatures w14:val="none"/>
+              </w:rPr>
+              <w:t>PrivateFeeSum</w:t>
+            </w:r>
+            <w:proofErr w:type="spellEnd"/>
             <w:proofErr w:type="gramStart"/>
             <w:r>
               <w:rPr>
@@ -863,26 +879,6 @@
                 <w:sz w:val="22"/>
                 <w14:ligatures w14:val="none"/>
               </w:rPr>
-              <w:t>{{</w:t>
-            </w:r>
-            <w:proofErr w:type="spellStart"/>
-            <w:r>
-              <w:rPr>
-                <w:rStyle w:val="ui-provider"/>
-                <w:kern w:val="0"/>
-                <w:sz w:val="22"/>
-                <w14:ligatures w14:val="none"/>
-              </w:rPr>
-              <w:t>PrivateFeeSum</w:t>
-            </w:r>
-            <w:proofErr w:type="spellEnd"/>
-            <w:r>
-              <w:rPr>
-                <w:rStyle w:val="ui-provider"/>
-                <w:kern w:val="0"/>
-                <w:sz w:val="22"/>
-                <w14:ligatures w14:val="none"/>
-              </w:rPr>
               <w:t>}}</w:t>
             </w:r>
             <w:bookmarkStart w:id="8" w:name="OLE_LINK28"/>
@@ -893,7 +889,7 @@
                 <w:sz w:val="22"/>
                 <w14:ligatures w14:val="none"/>
               </w:rPr>
-              <w:t>{{/</w:t>
+              <w:t>{</w:t>
             </w:r>
             <w:proofErr w:type="gramEnd"/>
             <w:r>
@@ -903,7 +899,7 @@
                 <w:sz w:val="22"/>
                 <w14:ligatures w14:val="none"/>
               </w:rPr>
-              <w:t>Private}}</w:t>
+              <w:t>{/Private}}</w:t>
             </w:r>
             <w:bookmarkEnd w:id="8"/>
           </w:p>
@@ -937,7 +933,16 @@
                 <w:sz w:val="22"/>
                 <w14:ligatures w14:val="none"/>
               </w:rPr>
-              <w:t>Per Diem</w:t>
+              <w:t xml:space="preserve">Per </w:t>
+            </w:r>
+            <w:proofErr w:type="gramStart"/>
+            <w:r>
+              <w:rPr>
+                <w:kern w:val="0"/>
+                <w:sz w:val="22"/>
+                <w14:ligatures w14:val="none"/>
+              </w:rPr>
+              <w:t>Diem</w:t>
             </w:r>
             <w:bookmarkEnd w:id="9"/>
             <w:r>
@@ -947,7 +952,17 @@
                 <w:sz w:val="22"/>
                 <w14:ligatures w14:val="none"/>
               </w:rPr>
-              <w:t>{{#</w:t>
+              <w:t>{</w:t>
+            </w:r>
+            <w:proofErr w:type="gramEnd"/>
+            <w:r>
+              <w:rPr>
+                <w:rStyle w:val="ui-provider"/>
+                <w:kern w:val="0"/>
+                <w:sz w:val="22"/>
+                <w14:ligatures w14:val="none"/>
+              </w:rPr>
+              <w:t>{#</w:t>
             </w:r>
             <w:r>
               <w:rPr>
@@ -1106,6 +1121,7 @@
               </w:rPr>
               <w:t>{{</w:t>
             </w:r>
+            <w:proofErr w:type="spellStart"/>
             <w:r>
               <w:rPr>
                 <w:kern w:val="0"/>
@@ -1121,7 +1137,18 @@
                 <w:sz w:val="22"/>
                 <w14:ligatures w14:val="none"/>
               </w:rPr>
-              <w:t>Sum}}</w:t>
+              <w:t>Sum</w:t>
+            </w:r>
+            <w:proofErr w:type="spellEnd"/>
+            <w:proofErr w:type="gramStart"/>
+            <w:r>
+              <w:rPr>
+                <w:rStyle w:val="ui-provider"/>
+                <w:kern w:val="0"/>
+                <w:sz w:val="22"/>
+                <w14:ligatures w14:val="none"/>
+              </w:rPr>
+              <w:t>}}</w:t>
             </w:r>
             <w:bookmarkStart w:id="14" w:name="OLE_LINK29"/>
             <w:r>
@@ -1131,7 +1158,17 @@
                 <w:sz w:val="22"/>
                 <w14:ligatures w14:val="none"/>
               </w:rPr>
-              <w:t>{{/</w:t>
+              <w:t>{</w:t>
+            </w:r>
+            <w:proofErr w:type="gramEnd"/>
+            <w:r>
+              <w:rPr>
+                <w:rStyle w:val="ui-provider"/>
+                <w:kern w:val="0"/>
+                <w:sz w:val="22"/>
+                <w14:ligatures w14:val="none"/>
+              </w:rPr>
+              <w:t>{/</w:t>
             </w:r>
             <w:r>
               <w:rPr>
@@ -1504,32 +1541,39 @@
                 <w:sz w:val="24"/>
                 <w:szCs w:val="24"/>
               </w:rPr>
-              <w:t xml:space="preserve">     Registration: </w:t>
+              <w:t xml:space="preserve">     Registration:</w:t>
             </w:r>
             <w:bookmarkStart w:id="15" w:name="OLE_LINK9"/>
             <w:r>
               <w:rPr>
+                <w:b/>
+                <w:bCs/>
                 <w:color w:val="000000" w:themeColor="text1"/>
                 <w:sz w:val="24"/>
                 <w:szCs w:val="24"/>
               </w:rPr>
+              <w:t xml:space="preserve"> </w:t>
+            </w:r>
+            <w:r>
+              <w:rPr>
+                <w:color w:val="000000" w:themeColor="text1"/>
+                <w:sz w:val="22"/>
+              </w:rPr>
               <w:t>{{</w:t>
             </w:r>
             <w:proofErr w:type="spellStart"/>
             <w:r>
               <w:rPr>
                 <w:color w:val="000000" w:themeColor="text1"/>
-                <w:sz w:val="24"/>
-                <w:szCs w:val="24"/>
-              </w:rPr>
-              <w:t>CertificateId</w:t>
+                <w:sz w:val="22"/>
+              </w:rPr>
+              <w:t>IF_isCertificateIdNotPresent</w:t>
             </w:r>
             <w:proofErr w:type="spellEnd"/>
             <w:r>
               <w:rPr>
                 <w:color w:val="000000" w:themeColor="text1"/>
-                <w:sz w:val="24"/>
-                <w:szCs w:val="24"/>
+                <w:sz w:val="22"/>
               </w:rPr>
               <w:t>}}</w:t>
             </w:r>
@@ -1785,16 +1829,6 @@
 <w:ftr xmlns:wpc="http://schemas.microsoft.com/office/word/2010/wordprocessingCanvas" xmlns:cx="http://schemas.microsoft.com/office/drawing/2014/chartex" xmlns:cx1="http://schemas.microsoft.com/office/drawing/2015/9/8/chartex" xmlns:cx2="http://schemas.microsoft.com/office/drawing/2015/10/21/chartex" xmlns:cx3="http://schemas.microsoft.com/office/drawing/2016/5/9/chartex" xmlns:cx4="http://schemas.microsoft.com/office/drawing/2016/5/10/chartex" xmlns:cx5="http://schemas.microsoft.com/office/drawing/2016/5/11/chartex" xmlns:cx6="http://schemas.microsoft.com/office/drawing/2016/5/12/chartex" xmlns:cx7="http://schemas.microsoft.com/office/drawing/2016/5/13/chartex" xmlns:cx8="http://schemas.microsoft.com/office/drawing/2016/5/14/chartex" xmlns:mc="http://schemas.openxmlformats.org/markup-compatibility/2006" xmlns:aink="http://schemas.microsoft.com/office/drawing/2016/ink" xmlns:am3d="http://schemas.microsoft.com/office/drawing/2017/model3d" xmlns:o="urn:schemas-microsoft-com:office:office" xmlns:oel="http://schemas.microsoft.com/office/2019/extlst" xmlns:r="http://schemas.openxmlformats.org/officeDocument/2006/relationships" xmlns:m="http://schemas.openxmlformats.org/officeDocument/2006/math" xmlns:v="urn:schemas-microsoft-com:vml" xmlns:wp14="http://schemas.microsoft.com/office/word/2010/wordprocessingDrawing" xmlns:wp="http://schemas.openxmlformats.org/drawingml/2006/wordprocessingDrawing" xmlns:w10="urn:schemas-microsoft-com:office:word" xmlns:w="http://schemas.openxmlformats.org/wordprocessingml/2006/main" xmlns:w14="http://schemas.microsoft.com/office/word/2010/wordml" xmlns:w15="http://schemas.microsoft.com/office/word/2012/wordml" xmlns:w16cex="http://schemas.microsoft.com/office/word/2018/wordml/cex" xmlns:w16cid="http://schemas.microsoft.com/office/word/2016/wordml/cid" xmlns:w16="http://schemas.microsoft.com/office/word/2018/wordml" xmlns:w16du="http://schemas.microsoft.com/office/word/2023/wordml/word16du" xmlns:w16sdtdh="http://schemas.microsoft.com/office/word/2020/wordml/sdtdatahash" xmlns:w16sdtfl="http://schemas.microsoft.com/office/word/2024/wordml/sdtformatlock" xmlns:w16se="http://schemas.microsoft.com/office/word/2015/wordml/symex" xmlns:wpg="http://schemas.microsoft.com/office/word/2010/wordprocessingGroup" xmlns:wpi="http://schemas.microsoft.com/office/word/2010/wordprocessingInk" xmlns:wne="http://schemas.microsoft.com/office/word/2006/wordml" xmlns:wps="http://schemas.microsoft.com/office/word/2010/wordprocessingShape" mc:Ignorable="w14 w15 w16se w16cid w16 w16cex w16sdtdh w16sdtfl w16du wp14">
   <w:p>
     <w:pPr>
-      <w:pStyle w:val="Footer"/>
-    </w:pPr>
-  </w:p>
-</w:ftr>
-</file>
-
-<file path=word/footer2.xml><?xml version="1.0" encoding="utf-8"?>
-<w:ftr xmlns:wpc="http://schemas.microsoft.com/office/word/2010/wordprocessingCanvas" xmlns:cx="http://schemas.microsoft.com/office/drawing/2014/chartex" xmlns:cx1="http://schemas.microsoft.com/office/drawing/2015/9/8/chartex" xmlns:cx2="http://schemas.microsoft.com/office/drawing/2015/10/21/chartex" xmlns:cx3="http://schemas.microsoft.com/office/drawing/2016/5/9/chartex" xmlns:cx4="http://schemas.microsoft.com/office/drawing/2016/5/10/chartex" xmlns:cx5="http://schemas.microsoft.com/office/drawing/2016/5/11/chartex" xmlns:cx6="http://schemas.microsoft.com/office/drawing/2016/5/12/chartex" xmlns:cx7="http://schemas.microsoft.com/office/drawing/2016/5/13/chartex" xmlns:cx8="http://schemas.microsoft.com/office/drawing/2016/5/14/chartex" xmlns:mc="http://schemas.openxmlformats.org/markup-compatibility/2006" xmlns:aink="http://schemas.microsoft.com/office/drawing/2016/ink" xmlns:am3d="http://schemas.microsoft.com/office/drawing/2017/model3d" xmlns:o="urn:schemas-microsoft-com:office:office" xmlns:oel="http://schemas.microsoft.com/office/2019/extlst" xmlns:r="http://schemas.openxmlformats.org/officeDocument/2006/relationships" xmlns:m="http://schemas.openxmlformats.org/officeDocument/2006/math" xmlns:v="urn:schemas-microsoft-com:vml" xmlns:wp14="http://schemas.microsoft.com/office/word/2010/wordprocessingDrawing" xmlns:wp="http://schemas.openxmlformats.org/drawingml/2006/wordprocessingDrawing" xmlns:w10="urn:schemas-microsoft-com:office:word" xmlns:w="http://schemas.openxmlformats.org/wordprocessingml/2006/main" xmlns:w14="http://schemas.microsoft.com/office/word/2010/wordml" xmlns:w15="http://schemas.microsoft.com/office/word/2012/wordml" xmlns:w16cex="http://schemas.microsoft.com/office/word/2018/wordml/cex" xmlns:w16cid="http://schemas.microsoft.com/office/word/2016/wordml/cid" xmlns:w16="http://schemas.microsoft.com/office/word/2018/wordml" xmlns:w16du="http://schemas.microsoft.com/office/word/2023/wordml/word16du" xmlns:w16sdtdh="http://schemas.microsoft.com/office/word/2020/wordml/sdtdatahash" xmlns:w16sdtfl="http://schemas.microsoft.com/office/word/2024/wordml/sdtformatlock" xmlns:w16se="http://schemas.microsoft.com/office/word/2015/wordml/symex" xmlns:wpg="http://schemas.microsoft.com/office/word/2010/wordprocessingGroup" xmlns:wpi="http://schemas.microsoft.com/office/word/2010/wordprocessingInk" xmlns:wne="http://schemas.microsoft.com/office/word/2006/wordml" xmlns:wps="http://schemas.microsoft.com/office/word/2010/wordprocessingShape" mc:Ignorable="w14 w15 w16se w16cid w16 w16cex w16sdtdh w16sdtfl w16du wp14">
-  <w:p>
-    <w:pPr>
       <w:jc w:val="right"/>
       <w:rPr>
         <w:noProof/>
@@ -1899,16 +1933,6 @@
       </w:rPr>
       <w:t xml:space="preserve"> (250) 953-0496</w:t>
     </w:r>
-  </w:p>
-</w:ftr>
-</file>
-
-<file path=word/footer3.xml><?xml version="1.0" encoding="utf-8"?>
-<w:ftr xmlns:wpc="http://schemas.microsoft.com/office/word/2010/wordprocessingCanvas" xmlns:cx="http://schemas.microsoft.com/office/drawing/2014/chartex" xmlns:cx1="http://schemas.microsoft.com/office/drawing/2015/9/8/chartex" xmlns:cx2="http://schemas.microsoft.com/office/drawing/2015/10/21/chartex" xmlns:cx3="http://schemas.microsoft.com/office/drawing/2016/5/9/chartex" xmlns:cx4="http://schemas.microsoft.com/office/drawing/2016/5/10/chartex" xmlns:cx5="http://schemas.microsoft.com/office/drawing/2016/5/11/chartex" xmlns:cx6="http://schemas.microsoft.com/office/drawing/2016/5/12/chartex" xmlns:cx7="http://schemas.microsoft.com/office/drawing/2016/5/13/chartex" xmlns:cx8="http://schemas.microsoft.com/office/drawing/2016/5/14/chartex" xmlns:mc="http://schemas.openxmlformats.org/markup-compatibility/2006" xmlns:aink="http://schemas.microsoft.com/office/drawing/2016/ink" xmlns:am3d="http://schemas.microsoft.com/office/drawing/2017/model3d" xmlns:o="urn:schemas-microsoft-com:office:office" xmlns:oel="http://schemas.microsoft.com/office/2019/extlst" xmlns:r="http://schemas.openxmlformats.org/officeDocument/2006/relationships" xmlns:m="http://schemas.openxmlformats.org/officeDocument/2006/math" xmlns:v="urn:schemas-microsoft-com:vml" xmlns:wp14="http://schemas.microsoft.com/office/word/2010/wordprocessingDrawing" xmlns:wp="http://schemas.openxmlformats.org/drawingml/2006/wordprocessingDrawing" xmlns:w10="urn:schemas-microsoft-com:office:word" xmlns:w="http://schemas.openxmlformats.org/wordprocessingml/2006/main" xmlns:w14="http://schemas.microsoft.com/office/word/2010/wordml" xmlns:w15="http://schemas.microsoft.com/office/word/2012/wordml" xmlns:w16cex="http://schemas.microsoft.com/office/word/2018/wordml/cex" xmlns:w16cid="http://schemas.microsoft.com/office/word/2016/wordml/cid" xmlns:w16="http://schemas.microsoft.com/office/word/2018/wordml" xmlns:w16du="http://schemas.microsoft.com/office/word/2023/wordml/word16du" xmlns:w16sdtdh="http://schemas.microsoft.com/office/word/2020/wordml/sdtdatahash" xmlns:w16sdtfl="http://schemas.microsoft.com/office/word/2024/wordml/sdtformatlock" xmlns:w16se="http://schemas.microsoft.com/office/word/2015/wordml/symex" xmlns:wpg="http://schemas.microsoft.com/office/word/2010/wordprocessingGroup" xmlns:wpi="http://schemas.microsoft.com/office/word/2010/wordprocessingInk" xmlns:wne="http://schemas.microsoft.com/office/word/2006/wordml" xmlns:wps="http://schemas.microsoft.com/office/word/2010/wordprocessingShape" mc:Ignorable="w14 w15 w16se w16cid w16 w16cex w16sdtdh w16sdtfl w16du wp14">
-  <w:p>
-    <w:pPr>
-      <w:pStyle w:val="Footer"/>
-    </w:pPr>
   </w:p>
 </w:ftr>
 </file>
@@ -1939,16 +1963,6 @@
 </file>
 
 <file path=word/header1.xml><?xml version="1.0" encoding="utf-8"?>
-<w:hdr xmlns:wpc="http://schemas.microsoft.com/office/word/2010/wordprocessingCanvas" xmlns:cx="http://schemas.microsoft.com/office/drawing/2014/chartex" xmlns:cx1="http://schemas.microsoft.com/office/drawing/2015/9/8/chartex" xmlns:cx2="http://schemas.microsoft.com/office/drawing/2015/10/21/chartex" xmlns:cx3="http://schemas.microsoft.com/office/drawing/2016/5/9/chartex" xmlns:cx4="http://schemas.microsoft.com/office/drawing/2016/5/10/chartex" xmlns:cx5="http://schemas.microsoft.com/office/drawing/2016/5/11/chartex" xmlns:cx6="http://schemas.microsoft.com/office/drawing/2016/5/12/chartex" xmlns:cx7="http://schemas.microsoft.com/office/drawing/2016/5/13/chartex" xmlns:cx8="http://schemas.microsoft.com/office/drawing/2016/5/14/chartex" xmlns:mc="http://schemas.openxmlformats.org/markup-compatibility/2006" xmlns:aink="http://schemas.microsoft.com/office/drawing/2016/ink" xmlns:am3d="http://schemas.microsoft.com/office/drawing/2017/model3d" xmlns:o="urn:schemas-microsoft-com:office:office" xmlns:oel="http://schemas.microsoft.com/office/2019/extlst" xmlns:r="http://schemas.openxmlformats.org/officeDocument/2006/relationships" xmlns:m="http://schemas.openxmlformats.org/officeDocument/2006/math" xmlns:v="urn:schemas-microsoft-com:vml" xmlns:wp14="http://schemas.microsoft.com/office/word/2010/wordprocessingDrawing" xmlns:wp="http://schemas.openxmlformats.org/drawingml/2006/wordprocessingDrawing" xmlns:w10="urn:schemas-microsoft-com:office:word" xmlns:w="http://schemas.openxmlformats.org/wordprocessingml/2006/main" xmlns:w14="http://schemas.microsoft.com/office/word/2010/wordml" xmlns:w15="http://schemas.microsoft.com/office/word/2012/wordml" xmlns:w16cex="http://schemas.microsoft.com/office/word/2018/wordml/cex" xmlns:w16cid="http://schemas.microsoft.com/office/word/2016/wordml/cid" xmlns:w16="http://schemas.microsoft.com/office/word/2018/wordml" xmlns:w16du="http://schemas.microsoft.com/office/word/2023/wordml/word16du" xmlns:w16sdtdh="http://schemas.microsoft.com/office/word/2020/wordml/sdtdatahash" xmlns:w16sdtfl="http://schemas.microsoft.com/office/word/2024/wordml/sdtformatlock" xmlns:w16se="http://schemas.microsoft.com/office/word/2015/wordml/symex" xmlns:wpg="http://schemas.microsoft.com/office/word/2010/wordprocessingGroup" xmlns:wpi="http://schemas.microsoft.com/office/word/2010/wordprocessingInk" xmlns:wne="http://schemas.microsoft.com/office/word/2006/wordml" xmlns:wps="http://schemas.microsoft.com/office/word/2010/wordprocessingShape" mc:Ignorable="w14 w15 w16se w16cid w16 w16cex w16sdtdh w16sdtfl w16du wp14">
-  <w:p>
-    <w:pPr>
-      <w:pStyle w:val="Header"/>
-    </w:pPr>
-  </w:p>
-</w:hdr>
-</file>
-
-<file path=word/header2.xml><?xml version="1.0" encoding="utf-8"?>
 <w:hdr xmlns:wpc="http://schemas.microsoft.com/office/word/2010/wordprocessingCanvas" xmlns:cx="http://schemas.microsoft.com/office/drawing/2014/chartex" xmlns:cx1="http://schemas.microsoft.com/office/drawing/2015/9/8/chartex" xmlns:cx2="http://schemas.microsoft.com/office/drawing/2015/10/21/chartex" xmlns:cx3="http://schemas.microsoft.com/office/drawing/2016/5/9/chartex" xmlns:cx4="http://schemas.microsoft.com/office/drawing/2016/5/10/chartex" xmlns:cx5="http://schemas.microsoft.com/office/drawing/2016/5/11/chartex" xmlns:cx6="http://schemas.microsoft.com/office/drawing/2016/5/12/chartex" xmlns:cx7="http://schemas.microsoft.com/office/drawing/2016/5/13/chartex" xmlns:cx8="http://schemas.microsoft.com/office/drawing/2016/5/14/chartex" xmlns:mc="http://schemas.openxmlformats.org/markup-compatibility/2006" xmlns:aink="http://schemas.microsoft.com/office/drawing/2016/ink" xmlns:am3d="http://schemas.microsoft.com/office/drawing/2017/model3d" xmlns:o="urn:schemas-microsoft-com:office:office" xmlns:oel="http://schemas.microsoft.com/office/2019/extlst" xmlns:r="http://schemas.openxmlformats.org/officeDocument/2006/relationships" xmlns:m="http://schemas.openxmlformats.org/officeDocument/2006/math" xmlns:v="urn:schemas-microsoft-com:vml" xmlns:wp14="http://schemas.microsoft.com/office/word/2010/wordprocessingDrawing" xmlns:wp="http://schemas.openxmlformats.org/drawingml/2006/wordprocessingDrawing" xmlns:w10="urn:schemas-microsoft-com:office:word" xmlns:w="http://schemas.openxmlformats.org/wordprocessingml/2006/main" xmlns:w14="http://schemas.microsoft.com/office/word/2010/wordml" xmlns:w15="http://schemas.microsoft.com/office/word/2012/wordml" xmlns:w16cex="http://schemas.microsoft.com/office/word/2018/wordml/cex" xmlns:w16cid="http://schemas.microsoft.com/office/word/2016/wordml/cid" xmlns:w16="http://schemas.microsoft.com/office/word/2018/wordml" xmlns:w16du="http://schemas.microsoft.com/office/word/2023/wordml/word16du" xmlns:w16sdtdh="http://schemas.microsoft.com/office/word/2020/wordml/sdtdatahash" xmlns:w16sdtfl="http://schemas.microsoft.com/office/word/2024/wordml/sdtformatlock" xmlns:w16se="http://schemas.microsoft.com/office/word/2015/wordml/symex" xmlns:wpg="http://schemas.microsoft.com/office/word/2010/wordprocessingGroup" xmlns:wpi="http://schemas.microsoft.com/office/word/2010/wordprocessingInk" xmlns:wne="http://schemas.microsoft.com/office/word/2006/wordml" xmlns:wps="http://schemas.microsoft.com/office/word/2010/wordprocessingShape" mc:Ignorable="w14 w15 w16se w16cid w16 w16cex w16sdtdh w16sdtfl w16du wp14">
   <w:p>
     <w:pPr>
@@ -2087,57 +2101,65 @@
         <w:b/>
         <w:bCs/>
         <w:noProof/>
-        <w:sz w:val="28"/>
-        <w:szCs w:val="28"/>
-      </w:rPr>
-      <w:t xml:space="preserve">     </w:t>
+        <w:sz w:val="22"/>
+      </w:rPr>
+      <w:t xml:space="preserve">        </w:t>
     </w:r>
     <w:bookmarkStart w:id="0" w:name="OLE_LINK2"/>
     <w:r>
       <w:rPr>
         <w:b/>
         <w:bCs/>
-        <w:sz w:val="28"/>
-        <w:szCs w:val="28"/>
-      </w:rPr>
-      <w:t>Invoice #:</w:t>
+        <w:sz w:val="30"/>
+        <w:szCs w:val="30"/>
+      </w:rPr>
+      <w:t xml:space="preserve">Invoice </w:t>
     </w:r>
     <w:r>
       <w:rPr>
         <w:b/>
         <w:bCs/>
-        <w:sz w:val="28"/>
-        <w:szCs w:val="28"/>
-      </w:rPr>
-      <w:t xml:space="preserve"> </w:t>
-    </w:r>
-    <w:bookmarkEnd w:id="0"/>
+        <w:sz w:val="30"/>
+        <w:szCs w:val="32"/>
+      </w:rPr>
+      <w:t>#:</w:t>
+    </w:r>
     <w:r>
       <w:rPr>
         <w:b/>
         <w:bCs/>
-        <w:sz w:val="28"/>
-        <w:szCs w:val="28"/>
-      </w:rPr>
-      <w:t>{{</w:t>
-    </w:r>
-    <w:proofErr w:type="spellStart"/>
+        <w:sz w:val="30"/>
+        <w:szCs w:val="32"/>
+      </w:rPr>
+      <w:t xml:space="preserve"> </w:t>
+    </w:r>
+    <w:bookmarkEnd w:id="0"/>
     <w:r>
       <w:rPr>
         <w:b/>
         <w:bCs/>
-        <w:sz w:val="28"/>
-        <w:szCs w:val="28"/>
-      </w:rPr>
-      <w:t>InvoiceId</w:t>
-    </w:r>
-    <w:proofErr w:type="spellEnd"/>
+        <w:sz w:val="30"/>
+        <w:szCs w:val="30"/>
+      </w:rPr>
+      <w:t>{{</w:t>
+    </w:r>
+    <w:proofErr w:type="spellStart"/>
     <w:r>
       <w:rPr>
         <w:b/>
         <w:bCs/>
-        <w:sz w:val="28"/>
-        <w:szCs w:val="28"/>
+        <w:sz w:val="30"/>
+        <w:szCs w:val="30"/>
+      </w:rPr>
+      <w:t>InvoiceId</w:t>
+    </w:r>
+    <w:proofErr w:type="spellEnd"/>
+    <w:r>
+      <w:rPr>
+        <w:b/>
+        <w:bCs/>
+        <w:sz w:val="30"/>
+        <w:szCs w:val="30"/>
       </w:rPr>
       <w:t>}}</w:t>
     </w:r>
@@ -2186,6 +2208,15 @@
         <w:sz w:val="22"/>
       </w:rPr>
       <w:t xml:space="preserve">  </w:t>
+    </w:r>
+    <w:r>
+      <w:rPr>
+        <w:i/>
+        <w:iCs/>
+        <w:noProof/>
+        <w:sz w:val="22"/>
+      </w:rPr>
+      <w:t xml:space="preserve">   </w:t>
     </w:r>
     <w:r>
       <w:rPr>
@@ -2291,16 +2322,6 @@
         <w:noProof/>
         <w:sz w:val="22"/>
       </w:rPr>
-    </w:pPr>
-  </w:p>
-</w:hdr>
-</file>
-
-<file path=word/header3.xml><?xml version="1.0" encoding="utf-8"?>
-<w:hdr xmlns:wpc="http://schemas.microsoft.com/office/word/2010/wordprocessingCanvas" xmlns:cx="http://schemas.microsoft.com/office/drawing/2014/chartex" xmlns:cx1="http://schemas.microsoft.com/office/drawing/2015/9/8/chartex" xmlns:cx2="http://schemas.microsoft.com/office/drawing/2015/10/21/chartex" xmlns:cx3="http://schemas.microsoft.com/office/drawing/2016/5/9/chartex" xmlns:cx4="http://schemas.microsoft.com/office/drawing/2016/5/10/chartex" xmlns:cx5="http://schemas.microsoft.com/office/drawing/2016/5/11/chartex" xmlns:cx6="http://schemas.microsoft.com/office/drawing/2016/5/12/chartex" xmlns:cx7="http://schemas.microsoft.com/office/drawing/2016/5/13/chartex" xmlns:cx8="http://schemas.microsoft.com/office/drawing/2016/5/14/chartex" xmlns:mc="http://schemas.openxmlformats.org/markup-compatibility/2006" xmlns:aink="http://schemas.microsoft.com/office/drawing/2016/ink" xmlns:am3d="http://schemas.microsoft.com/office/drawing/2017/model3d" xmlns:o="urn:schemas-microsoft-com:office:office" xmlns:oel="http://schemas.microsoft.com/office/2019/extlst" xmlns:r="http://schemas.openxmlformats.org/officeDocument/2006/relationships" xmlns:m="http://schemas.openxmlformats.org/officeDocument/2006/math" xmlns:v="urn:schemas-microsoft-com:vml" xmlns:wp14="http://schemas.microsoft.com/office/word/2010/wordprocessingDrawing" xmlns:wp="http://schemas.openxmlformats.org/drawingml/2006/wordprocessingDrawing" xmlns:w10="urn:schemas-microsoft-com:office:word" xmlns:w="http://schemas.openxmlformats.org/wordprocessingml/2006/main" xmlns:w14="http://schemas.microsoft.com/office/word/2010/wordml" xmlns:w15="http://schemas.microsoft.com/office/word/2012/wordml" xmlns:w16cex="http://schemas.microsoft.com/office/word/2018/wordml/cex" xmlns:w16cid="http://schemas.microsoft.com/office/word/2016/wordml/cid" xmlns:w16="http://schemas.microsoft.com/office/word/2018/wordml" xmlns:w16du="http://schemas.microsoft.com/office/word/2023/wordml/word16du" xmlns:w16sdtdh="http://schemas.microsoft.com/office/word/2020/wordml/sdtdatahash" xmlns:w16sdtfl="http://schemas.microsoft.com/office/word/2024/wordml/sdtformatlock" xmlns:w16se="http://schemas.microsoft.com/office/word/2015/wordml/symex" xmlns:wpg="http://schemas.microsoft.com/office/word/2010/wordprocessingGroup" xmlns:wpi="http://schemas.microsoft.com/office/word/2010/wordprocessingInk" xmlns:wne="http://schemas.microsoft.com/office/word/2006/wordml" xmlns:wps="http://schemas.microsoft.com/office/word/2010/wordprocessingShape" mc:Ignorable="w14 w15 w16se w16cid w16 w16cex w16sdtdh w16sdtfl w16du wp14">
-  <w:p>
-    <w:pPr>
-      <w:pStyle w:val="Header"/>
     </w:pPr>
   </w:p>
 </w:hdr>
@@ -2709,7 +2730,6 @@
   <w:style w:type="character" w:default="1" w:styleId="DefaultParagraphFont">
     <w:name w:val="Default Paragraph Font"/>
     <w:uiPriority w:val="1"/>
-    <w:semiHidden/>
     <w:unhideWhenUsed/>
   </w:style>
   <w:style w:type="table" w:default="1" w:styleId="TableNormal">
@@ -3124,7 +3144,6 @@
 
 <file path=docMetadata/LabelInfo.xml><?xml version="1.0" encoding="utf-8"?>
 <clbl:labelList xmlns:clbl="http://schemas.microsoft.com/office/2020/mipLabelMetadata">
-  <clbl:label id="{d9290083-bd2f-48a2-8ac5-09a524b17d15}" enabled="1" method="Privileged" siteId="{b9fec68c-c92d-461e-9a97-3d03a0f18b82}" contentBits="1" removed="0"/>
   <clbl:label id="{e0793d39-0939-496d-b129-198edd916feb}" enabled="0" method="" siteId="{e0793d39-0939-496d-b129-198edd916feb}" removed="1"/>
 </clbl:labelList>
 </file>
</xml_diff>

<commit_message>
EHIS-3342 Field balnk Issue - Application Fee
</commit_message>
<xml_diff>
--- a/ALR-DocgenTemplates/InvoiceTemplate.docx
+++ b/ALR-DocgenTemplates/InvoiceTemplate.docx
@@ -385,7 +385,7 @@
       <w:tblPr>
         <w:tblStyle w:val="TableGrid"/>
         <w:tblpPr w:leftFromText="180" w:rightFromText="180" w:vertAnchor="text" w:horzAnchor="margin" w:tblpY="1985"/>
-        <w:tblW w:w="10975" w:type="dxa"/>
+        <w:tblW w:w="11193" w:type="dxa"/>
         <w:tblBorders>
           <w:top w:val="none" w:sz="0" w:space="0" w:color="auto"/>
           <w:left w:val="none" w:sz="0" w:space="0" w:color="auto"/>
@@ -397,18 +397,18 @@
         <w:tblLook w:val="04A0" w:firstRow="1" w:lastRow="0" w:firstColumn="1" w:lastColumn="0" w:noHBand="0" w:noVBand="1"/>
       </w:tblPr>
       <w:tblGrid>
-        <w:gridCol w:w="2878"/>
-        <w:gridCol w:w="2631"/>
-        <w:gridCol w:w="2496"/>
-        <w:gridCol w:w="2970"/>
+        <w:gridCol w:w="2934"/>
+        <w:gridCol w:w="2683"/>
+        <w:gridCol w:w="2546"/>
+        <w:gridCol w:w="3030"/>
       </w:tblGrid>
       <w:tr>
         <w:trPr>
-          <w:trHeight w:val="467"/>
+          <w:trHeight w:val="414"/>
         </w:trPr>
         <w:tc>
           <w:tcPr>
-            <w:tcW w:w="2878" w:type="dxa"/>
+            <w:tcW w:w="2934" w:type="dxa"/>
           </w:tcPr>
           <w:p>
             <w:pPr>
@@ -434,7 +434,7 @@
         </w:tc>
         <w:tc>
           <w:tcPr>
-            <w:tcW w:w="2631" w:type="dxa"/>
+            <w:tcW w:w="2683" w:type="dxa"/>
           </w:tcPr>
           <w:p>
             <w:pPr>
@@ -460,7 +460,7 @@
         </w:tc>
         <w:tc>
           <w:tcPr>
-            <w:tcW w:w="2496" w:type="dxa"/>
+            <w:tcW w:w="2546" w:type="dxa"/>
           </w:tcPr>
           <w:p>
             <w:pPr>
@@ -486,7 +486,7 @@
         </w:tc>
         <w:tc>
           <w:tcPr>
-            <w:tcW w:w="2970" w:type="dxa"/>
+            <w:tcW w:w="3030" w:type="dxa"/>
           </w:tcPr>
           <w:p>
             <w:pPr>
@@ -513,11 +513,11 @@
       </w:tr>
       <w:tr>
         <w:trPr>
-          <w:trHeight w:val="368"/>
+          <w:trHeight w:val="326"/>
         </w:trPr>
         <w:tc>
           <w:tcPr>
-            <w:tcW w:w="2878" w:type="dxa"/>
+            <w:tcW w:w="2934" w:type="dxa"/>
           </w:tcPr>
           <w:p>
             <w:pPr>
@@ -570,7 +570,7 @@
         </w:tc>
         <w:tc>
           <w:tcPr>
-            <w:tcW w:w="2631" w:type="dxa"/>
+            <w:tcW w:w="2683" w:type="dxa"/>
           </w:tcPr>
           <w:p>
             <w:pPr>
@@ -604,7 +604,7 @@
         </w:tc>
         <w:tc>
           <w:tcPr>
-            <w:tcW w:w="2496" w:type="dxa"/>
+            <w:tcW w:w="2546" w:type="dxa"/>
           </w:tcPr>
           <w:p>
             <w:pPr>
@@ -643,7 +643,7 @@
         </w:tc>
         <w:tc>
           <w:tcPr>
-            <w:tcW w:w="2970" w:type="dxa"/>
+            <w:tcW w:w="3030" w:type="dxa"/>
           </w:tcPr>
           <w:p>
             <w:pPr>
@@ -717,11 +717,11 @@
       </w:tr>
       <w:tr>
         <w:trPr>
-          <w:trHeight w:val="368"/>
+          <w:trHeight w:val="326"/>
         </w:trPr>
         <w:tc>
           <w:tcPr>
-            <w:tcW w:w="2878" w:type="dxa"/>
+            <w:tcW w:w="2934" w:type="dxa"/>
           </w:tcPr>
           <w:p>
             <w:pPr>
@@ -749,7 +749,7 @@
         </w:tc>
         <w:tc>
           <w:tcPr>
-            <w:tcW w:w="2631" w:type="dxa"/>
+            <w:tcW w:w="2683" w:type="dxa"/>
           </w:tcPr>
           <w:p>
             <w:pPr>
@@ -791,7 +791,7 @@
         </w:tc>
         <w:tc>
           <w:tcPr>
-            <w:tcW w:w="2496" w:type="dxa"/>
+            <w:tcW w:w="2546" w:type="dxa"/>
           </w:tcPr>
           <w:p>
             <w:pPr>
@@ -837,7 +837,7 @@
         </w:tc>
         <w:tc>
           <w:tcPr>
-            <w:tcW w:w="2970" w:type="dxa"/>
+            <w:tcW w:w="3030" w:type="dxa"/>
           </w:tcPr>
           <w:p>
             <w:pPr>
@@ -907,17 +907,19 @@
       </w:tr>
       <w:tr>
         <w:trPr>
-          <w:trHeight w:val="368"/>
+          <w:trHeight w:val="326"/>
         </w:trPr>
         <w:tc>
           <w:tcPr>
-            <w:tcW w:w="2878" w:type="dxa"/>
+            <w:tcW w:w="2934" w:type="dxa"/>
           </w:tcPr>
           <w:p>
             <w:pPr>
               <w:contextualSpacing/>
               <w:rPr>
-                <w:sz w:val="22"/>
+                <w:kern w:val="0"/>
+                <w:sz w:val="22"/>
+                <w14:ligatures w14:val="none"/>
               </w:rPr>
             </w:pPr>
             <w:r>
@@ -985,7 +987,7 @@
         </w:tc>
         <w:tc>
           <w:tcPr>
-            <w:tcW w:w="2631" w:type="dxa"/>
+            <w:tcW w:w="2683" w:type="dxa"/>
           </w:tcPr>
           <w:p>
             <w:pPr>
@@ -1039,7 +1041,7 @@
         </w:tc>
         <w:tc>
           <w:tcPr>
-            <w:tcW w:w="2496" w:type="dxa"/>
+            <w:tcW w:w="2546" w:type="dxa"/>
           </w:tcPr>
           <w:p>
             <w:pPr>
@@ -1095,7 +1097,7 @@
         </w:tc>
         <w:tc>
           <w:tcPr>
-            <w:tcW w:w="2970" w:type="dxa"/>
+            <w:tcW w:w="3030" w:type="dxa"/>
           </w:tcPr>
           <w:p>
             <w:pPr>
@@ -1189,6 +1191,401 @@
             </w:r>
             <w:bookmarkEnd w:id="13"/>
             <w:bookmarkEnd w:id="14"/>
+          </w:p>
+        </w:tc>
+      </w:tr>
+      <w:tr>
+        <w:trPr>
+          <w:trHeight w:val="326"/>
+        </w:trPr>
+        <w:tc>
+          <w:tcPr>
+            <w:tcW w:w="2934" w:type="dxa"/>
+          </w:tcPr>
+          <w:p>
+            <w:pPr>
+              <w:contextualSpacing/>
+              <w:rPr>
+                <w:sz w:val="22"/>
+              </w:rPr>
+            </w:pPr>
+            <w:r>
+              <w:rPr>
+                <w:sz w:val="22"/>
+              </w:rPr>
+              <w:t xml:space="preserve">     </w:t>
+            </w:r>
+            <w:r>
+              <w:rPr>
+                <w:sz w:val="22"/>
+              </w:rPr>
+              <w:t>Application Fee{{#AppFee}}</w:t>
+            </w:r>
+          </w:p>
+        </w:tc>
+        <w:tc>
+          <w:tcPr>
+            <w:tcW w:w="2683" w:type="dxa"/>
+          </w:tcPr>
+          <w:p>
+            <w:pPr>
+              <w:contextualSpacing/>
+              <w:jc w:val="center"/>
+              <w:rPr>
+                <w:kern w:val="0"/>
+                <w:sz w:val="22"/>
+                <w14:ligatures w14:val="none"/>
+              </w:rPr>
+            </w:pPr>
+            <w:r>
+              <w:rPr>
+                <w:kern w:val="0"/>
+                <w:sz w:val="22"/>
+                <w14:ligatures w14:val="none"/>
+              </w:rPr>
+              <w:t>1</w:t>
+            </w:r>
+          </w:p>
+        </w:tc>
+        <w:tc>
+          <w:tcPr>
+            <w:tcW w:w="2546" w:type="dxa"/>
+          </w:tcPr>
+          <w:p>
+            <w:pPr>
+              <w:contextualSpacing/>
+              <w:jc w:val="center"/>
+              <w:rPr>
+                <w:rStyle w:val="ui-provider"/>
+                <w:kern w:val="0"/>
+                <w:sz w:val="22"/>
+                <w14:ligatures w14:val="none"/>
+              </w:rPr>
+            </w:pPr>
+            <w:r>
+              <w:rPr>
+                <w:rStyle w:val="ui-provider"/>
+                <w:kern w:val="0"/>
+                <w:sz w:val="24"/>
+                <w:szCs w:val="24"/>
+                <w14:ligatures w14:val="none"/>
+              </w:rPr>
+              <w:t>{{</w:t>
+            </w:r>
+            <w:proofErr w:type="spellStart"/>
+            <w:r>
+              <w:rPr>
+                <w:sz w:val="24"/>
+                <w:szCs w:val="24"/>
+              </w:rPr>
+              <w:t>AppSum</w:t>
+            </w:r>
+            <w:proofErr w:type="spellEnd"/>
+            <w:r>
+              <w:rPr>
+                <w:rStyle w:val="ui-provider"/>
+                <w:kern w:val="0"/>
+                <w:sz w:val="24"/>
+                <w:szCs w:val="24"/>
+                <w14:ligatures w14:val="none"/>
+              </w:rPr>
+              <w:t>}}</w:t>
+            </w:r>
+          </w:p>
+        </w:tc>
+        <w:tc>
+          <w:tcPr>
+            <w:tcW w:w="3030" w:type="dxa"/>
+          </w:tcPr>
+          <w:p>
+            <w:pPr>
+              <w:tabs>
+                <w:tab w:val="left" w:pos="340"/>
+              </w:tabs>
+              <w:contextualSpacing/>
+              <w:jc w:val="center"/>
+              <w:rPr>
+                <w:rStyle w:val="ui-provider"/>
+                <w:kern w:val="0"/>
+                <w:sz w:val="22"/>
+                <w14:ligatures w14:val="none"/>
+              </w:rPr>
+            </w:pPr>
+            <w:r>
+              <w:rPr>
+                <w:kern w:val="0"/>
+                <w:sz w:val="22"/>
+                <w14:ligatures w14:val="none"/>
+              </w:rPr>
+              <w:t>{{</w:t>
+            </w:r>
+            <w:proofErr w:type="spellStart"/>
+            <w:r>
+              <w:rPr>
+                <w:kern w:val="0"/>
+                <w:sz w:val="22"/>
+                <w14:ligatures w14:val="none"/>
+              </w:rPr>
+              <w:t>AppFeeSum</w:t>
+            </w:r>
+            <w:proofErr w:type="spellEnd"/>
+            <w:proofErr w:type="gramStart"/>
+            <w:r>
+              <w:rPr>
+                <w:kern w:val="0"/>
+                <w:sz w:val="22"/>
+                <w14:ligatures w14:val="none"/>
+              </w:rPr>
+              <w:t>}}{</w:t>
+            </w:r>
+            <w:proofErr w:type="gramEnd"/>
+            <w:r>
+              <w:rPr>
+                <w:kern w:val="0"/>
+                <w:sz w:val="22"/>
+                <w14:ligatures w14:val="none"/>
+              </w:rPr>
+              <w:t>{/</w:t>
+            </w:r>
+            <w:proofErr w:type="spellStart"/>
+            <w:r>
+              <w:rPr>
+                <w:kern w:val="0"/>
+                <w:sz w:val="22"/>
+                <w14:ligatures w14:val="none"/>
+              </w:rPr>
+              <w:t>AppFee</w:t>
+            </w:r>
+            <w:proofErr w:type="spellEnd"/>
+            <w:r>
+              <w:rPr>
+                <w:kern w:val="0"/>
+                <w:sz w:val="22"/>
+                <w14:ligatures w14:val="none"/>
+              </w:rPr>
+              <w:t>}}</w:t>
+            </w:r>
+          </w:p>
+        </w:tc>
+      </w:tr>
+      <w:tr>
+        <w:trPr>
+          <w:trHeight w:val="326"/>
+        </w:trPr>
+        <w:tc>
+          <w:tcPr>
+            <w:tcW w:w="2934" w:type="dxa"/>
+          </w:tcPr>
+          <w:p>
+            <w:pPr>
+              <w:contextualSpacing/>
+              <w:rPr>
+                <w:sz w:val="24"/>
+                <w:szCs w:val="24"/>
+              </w:rPr>
+            </w:pPr>
+            <w:r>
+              <w:rPr>
+                <w:sz w:val="24"/>
+                <w:szCs w:val="24"/>
+              </w:rPr>
+              <w:t xml:space="preserve">   </w:t>
+            </w:r>
+          </w:p>
+        </w:tc>
+        <w:tc>
+          <w:tcPr>
+            <w:tcW w:w="2683" w:type="dxa"/>
+          </w:tcPr>
+          <w:p>
+            <w:pPr>
+              <w:contextualSpacing/>
+              <w:jc w:val="center"/>
+              <w:rPr>
+                <w:kern w:val="0"/>
+                <w:sz w:val="22"/>
+                <w14:ligatures w14:val="none"/>
+              </w:rPr>
+            </w:pPr>
+          </w:p>
+        </w:tc>
+        <w:tc>
+          <w:tcPr>
+            <w:tcW w:w="2546" w:type="dxa"/>
+          </w:tcPr>
+          <w:p>
+            <w:pPr>
+              <w:contextualSpacing/>
+              <w:jc w:val="center"/>
+              <w:rPr>
+                <w:rStyle w:val="ui-provider"/>
+                <w:kern w:val="0"/>
+                <w:sz w:val="24"/>
+                <w:szCs w:val="24"/>
+                <w14:ligatures w14:val="none"/>
+              </w:rPr>
+            </w:pPr>
+          </w:p>
+        </w:tc>
+        <w:tc>
+          <w:tcPr>
+            <w:tcW w:w="3030" w:type="dxa"/>
+          </w:tcPr>
+          <w:p>
+            <w:pPr>
+              <w:tabs>
+                <w:tab w:val="left" w:pos="340"/>
+              </w:tabs>
+              <w:contextualSpacing/>
+              <w:rPr>
+                <w:rStyle w:val="ui-provider"/>
+                <w:kern w:val="0"/>
+                <w:sz w:val="22"/>
+                <w14:ligatures w14:val="none"/>
+              </w:rPr>
+            </w:pPr>
+          </w:p>
+        </w:tc>
+      </w:tr>
+      <w:tr>
+        <w:trPr>
+          <w:trHeight w:val="326"/>
+        </w:trPr>
+        <w:tc>
+          <w:tcPr>
+            <w:tcW w:w="2934" w:type="dxa"/>
+          </w:tcPr>
+          <w:p>
+            <w:pPr>
+              <w:contextualSpacing/>
+              <w:rPr>
+                <w:sz w:val="22"/>
+              </w:rPr>
+            </w:pPr>
+          </w:p>
+        </w:tc>
+        <w:tc>
+          <w:tcPr>
+            <w:tcW w:w="2683" w:type="dxa"/>
+          </w:tcPr>
+          <w:p>
+            <w:pPr>
+              <w:contextualSpacing/>
+              <w:jc w:val="center"/>
+              <w:rPr>
+                <w:kern w:val="0"/>
+                <w:sz w:val="22"/>
+                <w14:ligatures w14:val="none"/>
+              </w:rPr>
+            </w:pPr>
+          </w:p>
+        </w:tc>
+        <w:tc>
+          <w:tcPr>
+            <w:tcW w:w="2546" w:type="dxa"/>
+          </w:tcPr>
+          <w:p>
+            <w:pPr>
+              <w:contextualSpacing/>
+              <w:jc w:val="center"/>
+              <w:rPr>
+                <w:rStyle w:val="ui-provider"/>
+                <w:kern w:val="0"/>
+                <w:sz w:val="22"/>
+                <w14:ligatures w14:val="none"/>
+              </w:rPr>
+            </w:pPr>
+          </w:p>
+        </w:tc>
+        <w:tc>
+          <w:tcPr>
+            <w:tcW w:w="3030" w:type="dxa"/>
+          </w:tcPr>
+          <w:p>
+            <w:pPr>
+              <w:tabs>
+                <w:tab w:val="left" w:pos="340"/>
+              </w:tabs>
+              <w:contextualSpacing/>
+              <w:jc w:val="center"/>
+              <w:rPr>
+                <w:rStyle w:val="ui-provider"/>
+                <w:kern w:val="0"/>
+                <w:sz w:val="22"/>
+                <w14:ligatures w14:val="none"/>
+              </w:rPr>
+            </w:pPr>
+          </w:p>
+        </w:tc>
+      </w:tr>
+      <w:tr>
+        <w:trPr>
+          <w:trHeight w:val="326"/>
+        </w:trPr>
+        <w:tc>
+          <w:tcPr>
+            <w:tcW w:w="2934" w:type="dxa"/>
+          </w:tcPr>
+          <w:p>
+            <w:pPr>
+              <w:contextualSpacing/>
+              <w:rPr>
+                <w:sz w:val="22"/>
+              </w:rPr>
+            </w:pPr>
+          </w:p>
+        </w:tc>
+        <w:tc>
+          <w:tcPr>
+            <w:tcW w:w="2683" w:type="dxa"/>
+          </w:tcPr>
+          <w:p>
+            <w:pPr>
+              <w:contextualSpacing/>
+              <w:jc w:val="center"/>
+              <w:rPr>
+                <w:kern w:val="0"/>
+                <w:sz w:val="22"/>
+                <w14:ligatures w14:val="none"/>
+              </w:rPr>
+            </w:pPr>
+          </w:p>
+        </w:tc>
+        <w:tc>
+          <w:tcPr>
+            <w:tcW w:w="2546" w:type="dxa"/>
+          </w:tcPr>
+          <w:p>
+            <w:pPr>
+              <w:contextualSpacing/>
+              <w:jc w:val="center"/>
+              <w:rPr>
+                <w:rStyle w:val="ui-provider"/>
+                <w:kern w:val="0"/>
+                <w:sz w:val="22"/>
+                <w14:ligatures w14:val="none"/>
+              </w:rPr>
+            </w:pPr>
+          </w:p>
+        </w:tc>
+        <w:tc>
+          <w:tcPr>
+            <w:tcW w:w="3030" w:type="dxa"/>
+          </w:tcPr>
+          <w:p>
+            <w:pPr>
+              <w:tabs>
+                <w:tab w:val="left" w:pos="340"/>
+              </w:tabs>
+              <w:contextualSpacing/>
+              <w:jc w:val="center"/>
+              <w:rPr>
+                <w:rStyle w:val="ui-provider"/>
+                <w:kern w:val="0"/>
+                <w:sz w:val="22"/>
+                <w14:ligatures w14:val="none"/>
+              </w:rPr>
+            </w:pPr>
           </w:p>
         </w:tc>
       </w:tr>
@@ -1312,7 +1709,6 @@
     </w:p>
     <w:p>
       <w:pPr>
-        <w:jc w:val="center"/>
         <w:rPr>
           <w:color w:val="000000" w:themeColor="text1"/>
           <w:sz w:val="24"/>
@@ -1349,27 +1745,6 @@
           <w:sz w:val="22"/>
         </w:rPr>
       </w:pPr>
-    </w:p>
-    <w:p>
-      <w:pPr>
-        <w:rPr>
-          <w:b/>
-          <w:bCs/>
-          <w:noProof/>
-          <w:sz w:val="24"/>
-          <w:szCs w:val="24"/>
-        </w:rPr>
-      </w:pPr>
-      <w:r>
-        <w:rPr>
-          <w:b/>
-          <w:bCs/>
-          <w:noProof/>
-          <w:sz w:val="24"/>
-          <w:szCs w:val="24"/>
-        </w:rPr>
-        <w:t xml:space="preserve">  </w:t>
-      </w:r>
     </w:p>
     <w:p>
       <w:pPr>
@@ -1514,8 +1889,8 @@
       </w:tblPr>
       <w:tblGrid>
         <w:gridCol w:w="5125"/>
-        <w:gridCol w:w="4140"/>
-        <w:gridCol w:w="4325"/>
+        <w:gridCol w:w="3965"/>
+        <w:gridCol w:w="4500"/>
       </w:tblGrid>
       <w:tr>
         <w:trPr>
@@ -1541,9 +1916,9 @@
                 <w:sz w:val="24"/>
                 <w:szCs w:val="24"/>
               </w:rPr>
-              <w:t xml:space="preserve">     Registration:</w:t>
-            </w:r>
-            <w:bookmarkStart w:id="15" w:name="OLE_LINK9"/>
+              <w:t xml:space="preserve">  </w:t>
+            </w:r>
+            <w:proofErr w:type="gramStart"/>
             <w:r>
               <w:rPr>
                 <w:b/>
@@ -1552,46 +1927,9 @@
                 <w:sz w:val="24"/>
                 <w:szCs w:val="24"/>
               </w:rPr>
-              <w:t xml:space="preserve"> </w:t>
-            </w:r>
-            <w:r>
-              <w:rPr>
-                <w:color w:val="000000" w:themeColor="text1"/>
-                <w:sz w:val="22"/>
-              </w:rPr>
-              <w:t>{{</w:t>
-            </w:r>
-            <w:proofErr w:type="spellStart"/>
-            <w:r>
-              <w:rPr>
-                <w:color w:val="000000" w:themeColor="text1"/>
-                <w:sz w:val="22"/>
-              </w:rPr>
-              <w:t>IF_isCertificateIdNotPresent</w:t>
-            </w:r>
-            <w:proofErr w:type="spellEnd"/>
-            <w:r>
-              <w:rPr>
-                <w:color w:val="000000" w:themeColor="text1"/>
-                <w:sz w:val="22"/>
-              </w:rPr>
-              <w:t>}}</w:t>
-            </w:r>
-            <w:bookmarkEnd w:id="15"/>
-          </w:p>
-        </w:tc>
-        <w:tc>
-          <w:tcPr>
-            <w:tcW w:w="4140" w:type="dxa"/>
-            <w:hideMark/>
-          </w:tcPr>
-          <w:p>
-            <w:pPr>
-              <w:rPr>
-                <w:noProof/>
-                <w:sz w:val="22"/>
-              </w:rPr>
-            </w:pPr>
+              <w:t>Registration:</w:t>
+            </w:r>
+            <w:bookmarkStart w:id="15" w:name="OLE_LINK9"/>
             <w:r>
               <w:rPr>
                 <w:b/>
@@ -1600,13 +1938,72 @@
                 <w:sz w:val="24"/>
                 <w:szCs w:val="24"/>
               </w:rPr>
-              <w:t xml:space="preserve">                                     Invoice total:</w:t>
-            </w:r>
-          </w:p>
-        </w:tc>
-        <w:tc>
-          <w:tcPr>
-            <w:tcW w:w="4325" w:type="dxa"/>
+              <w:t xml:space="preserve"> </w:t>
+            </w:r>
+            <w:r>
+              <w:rPr>
+                <w:color w:val="000000" w:themeColor="text1"/>
+                <w:sz w:val="22"/>
+              </w:rPr>
+              <w:t>{{</w:t>
+            </w:r>
+            <w:proofErr w:type="spellStart"/>
+            <w:proofErr w:type="gramEnd"/>
+            <w:r>
+              <w:rPr>
+                <w:color w:val="000000" w:themeColor="text1"/>
+                <w:sz w:val="22"/>
+              </w:rPr>
+              <w:t>IF_isCertificateIdNotPresent</w:t>
+            </w:r>
+            <w:proofErr w:type="spellEnd"/>
+            <w:r>
+              <w:rPr>
+                <w:color w:val="000000" w:themeColor="text1"/>
+                <w:sz w:val="22"/>
+              </w:rPr>
+              <w:t>}}</w:t>
+            </w:r>
+            <w:bookmarkEnd w:id="15"/>
+          </w:p>
+        </w:tc>
+        <w:tc>
+          <w:tcPr>
+            <w:tcW w:w="3965" w:type="dxa"/>
+            <w:hideMark/>
+          </w:tcPr>
+          <w:p>
+            <w:pPr>
+              <w:rPr>
+                <w:noProof/>
+                <w:sz w:val="22"/>
+              </w:rPr>
+            </w:pPr>
+            <w:r>
+              <w:rPr>
+                <w:b/>
+                <w:bCs/>
+                <w:color w:val="000000" w:themeColor="text1"/>
+                <w:sz w:val="24"/>
+                <w:szCs w:val="24"/>
+              </w:rPr>
+              <w:t xml:space="preserve">                                  Invoice total:</w:t>
+            </w:r>
+            <w:r>
+              <w:rPr>
+                <w:b/>
+                <w:bCs/>
+                <w:color w:val="000000" w:themeColor="text1"/>
+                <w:sz w:val="24"/>
+                <w:szCs w:val="24"/>
+              </w:rPr>
+              <w:t xml:space="preserve">       </w:t>
+            </w:r>
+          </w:p>
+        </w:tc>
+        <w:tc>
+          <w:tcPr>
+            <w:tcW w:w="4500" w:type="dxa"/>
           </w:tcPr>
           <w:p>
             <w:pPr>
@@ -1688,7 +2085,7 @@
         </w:tc>
         <w:tc>
           <w:tcPr>
-            <w:tcW w:w="4140" w:type="dxa"/>
+            <w:tcW w:w="3965" w:type="dxa"/>
             <w:hideMark/>
           </w:tcPr>
           <w:p>
@@ -1710,13 +2107,13 @@
                 <w:szCs w:val="24"/>
                 <w14:ligatures w14:val="none"/>
               </w:rPr>
-              <w:t xml:space="preserve">                                     Balance due:</w:t>
-            </w:r>
-          </w:p>
-        </w:tc>
-        <w:tc>
-          <w:tcPr>
-            <w:tcW w:w="4325" w:type="dxa"/>
+              <w:t xml:space="preserve">                                  Balance due:</w:t>
+            </w:r>
+          </w:p>
+        </w:tc>
+        <w:tc>
+          <w:tcPr>
+            <w:tcW w:w="4500" w:type="dxa"/>
           </w:tcPr>
           <w:p>
             <w:pPr>
@@ -1774,20 +2171,6 @@
           <w:sz w:val="22"/>
         </w:rPr>
       </w:pPr>
-      <w:r>
-        <w:rPr>
-          <w:noProof/>
-          <w:sz w:val="22"/>
-        </w:rPr>
-        <w:t xml:space="preserve">  </w:t>
-      </w:r>
-      <w:r>
-        <w:rPr>
-          <w:noProof/>
-          <w:sz w:val="22"/>
-        </w:rPr>
-        <w:tab/>
-      </w:r>
     </w:p>
     <w:sectPr>
       <w:type w:val="continuous"/>
@@ -2730,6 +3113,7 @@
   <w:style w:type="character" w:default="1" w:styleId="DefaultParagraphFont">
     <w:name w:val="Default Paragraph Font"/>
     <w:uiPriority w:val="1"/>
+    <w:semiHidden/>
     <w:unhideWhenUsed/>
   </w:style>
   <w:style w:type="table" w:default="1" w:styleId="TableNormal">

</xml_diff>

<commit_message>
Revert "EHIS-3342 Field blank Issue - Application Fee"
</commit_message>
<xml_diff>
--- a/ALR-DocgenTemplates/InvoiceTemplate.docx
+++ b/ALR-DocgenTemplates/InvoiceTemplate.docx
@@ -385,7 +385,7 @@
       <w:tblPr>
         <w:tblStyle w:val="TableGrid"/>
         <w:tblpPr w:leftFromText="180" w:rightFromText="180" w:vertAnchor="text" w:horzAnchor="margin" w:tblpY="1985"/>
-        <w:tblW w:w="11193" w:type="dxa"/>
+        <w:tblW w:w="10975" w:type="dxa"/>
         <w:tblBorders>
           <w:top w:val="none" w:sz="0" w:space="0" w:color="auto"/>
           <w:left w:val="none" w:sz="0" w:space="0" w:color="auto"/>
@@ -397,18 +397,18 @@
         <w:tblLook w:val="04A0" w:firstRow="1" w:lastRow="0" w:firstColumn="1" w:lastColumn="0" w:noHBand="0" w:noVBand="1"/>
       </w:tblPr>
       <w:tblGrid>
-        <w:gridCol w:w="2934"/>
-        <w:gridCol w:w="2683"/>
-        <w:gridCol w:w="2546"/>
-        <w:gridCol w:w="3030"/>
+        <w:gridCol w:w="2878"/>
+        <w:gridCol w:w="2631"/>
+        <w:gridCol w:w="2496"/>
+        <w:gridCol w:w="2970"/>
       </w:tblGrid>
       <w:tr>
         <w:trPr>
-          <w:trHeight w:val="414"/>
+          <w:trHeight w:val="467"/>
         </w:trPr>
         <w:tc>
           <w:tcPr>
-            <w:tcW w:w="2934" w:type="dxa"/>
+            <w:tcW w:w="2878" w:type="dxa"/>
           </w:tcPr>
           <w:p>
             <w:pPr>
@@ -434,7 +434,7 @@
         </w:tc>
         <w:tc>
           <w:tcPr>
-            <w:tcW w:w="2683" w:type="dxa"/>
+            <w:tcW w:w="2631" w:type="dxa"/>
           </w:tcPr>
           <w:p>
             <w:pPr>
@@ -460,7 +460,7 @@
         </w:tc>
         <w:tc>
           <w:tcPr>
-            <w:tcW w:w="2546" w:type="dxa"/>
+            <w:tcW w:w="2496" w:type="dxa"/>
           </w:tcPr>
           <w:p>
             <w:pPr>
@@ -486,7 +486,7 @@
         </w:tc>
         <w:tc>
           <w:tcPr>
-            <w:tcW w:w="3030" w:type="dxa"/>
+            <w:tcW w:w="2970" w:type="dxa"/>
           </w:tcPr>
           <w:p>
             <w:pPr>
@@ -513,11 +513,11 @@
       </w:tr>
       <w:tr>
         <w:trPr>
-          <w:trHeight w:val="326"/>
+          <w:trHeight w:val="368"/>
         </w:trPr>
         <w:tc>
           <w:tcPr>
-            <w:tcW w:w="2934" w:type="dxa"/>
+            <w:tcW w:w="2878" w:type="dxa"/>
           </w:tcPr>
           <w:p>
             <w:pPr>
@@ -570,7 +570,7 @@
         </w:tc>
         <w:tc>
           <w:tcPr>
-            <w:tcW w:w="2683" w:type="dxa"/>
+            <w:tcW w:w="2631" w:type="dxa"/>
           </w:tcPr>
           <w:p>
             <w:pPr>
@@ -604,7 +604,7 @@
         </w:tc>
         <w:tc>
           <w:tcPr>
-            <w:tcW w:w="2546" w:type="dxa"/>
+            <w:tcW w:w="2496" w:type="dxa"/>
           </w:tcPr>
           <w:p>
             <w:pPr>
@@ -643,7 +643,7 @@
         </w:tc>
         <w:tc>
           <w:tcPr>
-            <w:tcW w:w="3030" w:type="dxa"/>
+            <w:tcW w:w="2970" w:type="dxa"/>
           </w:tcPr>
           <w:p>
             <w:pPr>
@@ -717,11 +717,11 @@
       </w:tr>
       <w:tr>
         <w:trPr>
-          <w:trHeight w:val="326"/>
+          <w:trHeight w:val="368"/>
         </w:trPr>
         <w:tc>
           <w:tcPr>
-            <w:tcW w:w="2934" w:type="dxa"/>
+            <w:tcW w:w="2878" w:type="dxa"/>
           </w:tcPr>
           <w:p>
             <w:pPr>
@@ -749,7 +749,7 @@
         </w:tc>
         <w:tc>
           <w:tcPr>
-            <w:tcW w:w="2683" w:type="dxa"/>
+            <w:tcW w:w="2631" w:type="dxa"/>
           </w:tcPr>
           <w:p>
             <w:pPr>
@@ -791,7 +791,7 @@
         </w:tc>
         <w:tc>
           <w:tcPr>
-            <w:tcW w:w="2546" w:type="dxa"/>
+            <w:tcW w:w="2496" w:type="dxa"/>
           </w:tcPr>
           <w:p>
             <w:pPr>
@@ -837,7 +837,7 @@
         </w:tc>
         <w:tc>
           <w:tcPr>
-            <w:tcW w:w="3030" w:type="dxa"/>
+            <w:tcW w:w="2970" w:type="dxa"/>
           </w:tcPr>
           <w:p>
             <w:pPr>
@@ -907,19 +907,17 @@
       </w:tr>
       <w:tr>
         <w:trPr>
-          <w:trHeight w:val="326"/>
+          <w:trHeight w:val="368"/>
         </w:trPr>
         <w:tc>
           <w:tcPr>
-            <w:tcW w:w="2934" w:type="dxa"/>
+            <w:tcW w:w="2878" w:type="dxa"/>
           </w:tcPr>
           <w:p>
             <w:pPr>
               <w:contextualSpacing/>
               <w:rPr>
-                <w:kern w:val="0"/>
-                <w:sz w:val="22"/>
-                <w14:ligatures w14:val="none"/>
+                <w:sz w:val="22"/>
               </w:rPr>
             </w:pPr>
             <w:r>
@@ -987,7 +985,7 @@
         </w:tc>
         <w:tc>
           <w:tcPr>
-            <w:tcW w:w="2683" w:type="dxa"/>
+            <w:tcW w:w="2631" w:type="dxa"/>
           </w:tcPr>
           <w:p>
             <w:pPr>
@@ -1041,7 +1039,7 @@
         </w:tc>
         <w:tc>
           <w:tcPr>
-            <w:tcW w:w="2546" w:type="dxa"/>
+            <w:tcW w:w="2496" w:type="dxa"/>
           </w:tcPr>
           <w:p>
             <w:pPr>
@@ -1097,7 +1095,7 @@
         </w:tc>
         <w:tc>
           <w:tcPr>
-            <w:tcW w:w="3030" w:type="dxa"/>
+            <w:tcW w:w="2970" w:type="dxa"/>
           </w:tcPr>
           <w:p>
             <w:pPr>
@@ -1191,401 +1189,6 @@
             </w:r>
             <w:bookmarkEnd w:id="13"/>
             <w:bookmarkEnd w:id="14"/>
-          </w:p>
-        </w:tc>
-      </w:tr>
-      <w:tr>
-        <w:trPr>
-          <w:trHeight w:val="326"/>
-        </w:trPr>
-        <w:tc>
-          <w:tcPr>
-            <w:tcW w:w="2934" w:type="dxa"/>
-          </w:tcPr>
-          <w:p>
-            <w:pPr>
-              <w:contextualSpacing/>
-              <w:rPr>
-                <w:sz w:val="22"/>
-              </w:rPr>
-            </w:pPr>
-            <w:r>
-              <w:rPr>
-                <w:sz w:val="22"/>
-              </w:rPr>
-              <w:t xml:space="preserve">     </w:t>
-            </w:r>
-            <w:r>
-              <w:rPr>
-                <w:sz w:val="22"/>
-              </w:rPr>
-              <w:t>Application Fee{{#AppFee}}</w:t>
-            </w:r>
-          </w:p>
-        </w:tc>
-        <w:tc>
-          <w:tcPr>
-            <w:tcW w:w="2683" w:type="dxa"/>
-          </w:tcPr>
-          <w:p>
-            <w:pPr>
-              <w:contextualSpacing/>
-              <w:jc w:val="center"/>
-              <w:rPr>
-                <w:kern w:val="0"/>
-                <w:sz w:val="22"/>
-                <w14:ligatures w14:val="none"/>
-              </w:rPr>
-            </w:pPr>
-            <w:r>
-              <w:rPr>
-                <w:kern w:val="0"/>
-                <w:sz w:val="22"/>
-                <w14:ligatures w14:val="none"/>
-              </w:rPr>
-              <w:t>1</w:t>
-            </w:r>
-          </w:p>
-        </w:tc>
-        <w:tc>
-          <w:tcPr>
-            <w:tcW w:w="2546" w:type="dxa"/>
-          </w:tcPr>
-          <w:p>
-            <w:pPr>
-              <w:contextualSpacing/>
-              <w:jc w:val="center"/>
-              <w:rPr>
-                <w:rStyle w:val="ui-provider"/>
-                <w:kern w:val="0"/>
-                <w:sz w:val="22"/>
-                <w14:ligatures w14:val="none"/>
-              </w:rPr>
-            </w:pPr>
-            <w:r>
-              <w:rPr>
-                <w:rStyle w:val="ui-provider"/>
-                <w:kern w:val="0"/>
-                <w:sz w:val="24"/>
-                <w:szCs w:val="24"/>
-                <w14:ligatures w14:val="none"/>
-              </w:rPr>
-              <w:t>{{</w:t>
-            </w:r>
-            <w:proofErr w:type="spellStart"/>
-            <w:r>
-              <w:rPr>
-                <w:sz w:val="24"/>
-                <w:szCs w:val="24"/>
-              </w:rPr>
-              <w:t>AppSum</w:t>
-            </w:r>
-            <w:proofErr w:type="spellEnd"/>
-            <w:r>
-              <w:rPr>
-                <w:rStyle w:val="ui-provider"/>
-                <w:kern w:val="0"/>
-                <w:sz w:val="24"/>
-                <w:szCs w:val="24"/>
-                <w14:ligatures w14:val="none"/>
-              </w:rPr>
-              <w:t>}}</w:t>
-            </w:r>
-          </w:p>
-        </w:tc>
-        <w:tc>
-          <w:tcPr>
-            <w:tcW w:w="3030" w:type="dxa"/>
-          </w:tcPr>
-          <w:p>
-            <w:pPr>
-              <w:tabs>
-                <w:tab w:val="left" w:pos="340"/>
-              </w:tabs>
-              <w:contextualSpacing/>
-              <w:jc w:val="center"/>
-              <w:rPr>
-                <w:rStyle w:val="ui-provider"/>
-                <w:kern w:val="0"/>
-                <w:sz w:val="22"/>
-                <w14:ligatures w14:val="none"/>
-              </w:rPr>
-            </w:pPr>
-            <w:r>
-              <w:rPr>
-                <w:kern w:val="0"/>
-                <w:sz w:val="22"/>
-                <w14:ligatures w14:val="none"/>
-              </w:rPr>
-              <w:t>{{</w:t>
-            </w:r>
-            <w:proofErr w:type="spellStart"/>
-            <w:r>
-              <w:rPr>
-                <w:kern w:val="0"/>
-                <w:sz w:val="22"/>
-                <w14:ligatures w14:val="none"/>
-              </w:rPr>
-              <w:t>AppFeeSum</w:t>
-            </w:r>
-            <w:proofErr w:type="spellEnd"/>
-            <w:proofErr w:type="gramStart"/>
-            <w:r>
-              <w:rPr>
-                <w:kern w:val="0"/>
-                <w:sz w:val="22"/>
-                <w14:ligatures w14:val="none"/>
-              </w:rPr>
-              <w:t>}}{</w:t>
-            </w:r>
-            <w:proofErr w:type="gramEnd"/>
-            <w:r>
-              <w:rPr>
-                <w:kern w:val="0"/>
-                <w:sz w:val="22"/>
-                <w14:ligatures w14:val="none"/>
-              </w:rPr>
-              <w:t>{/</w:t>
-            </w:r>
-            <w:proofErr w:type="spellStart"/>
-            <w:r>
-              <w:rPr>
-                <w:kern w:val="0"/>
-                <w:sz w:val="22"/>
-                <w14:ligatures w14:val="none"/>
-              </w:rPr>
-              <w:t>AppFee</w:t>
-            </w:r>
-            <w:proofErr w:type="spellEnd"/>
-            <w:r>
-              <w:rPr>
-                <w:kern w:val="0"/>
-                <w:sz w:val="22"/>
-                <w14:ligatures w14:val="none"/>
-              </w:rPr>
-              <w:t>}}</w:t>
-            </w:r>
-          </w:p>
-        </w:tc>
-      </w:tr>
-      <w:tr>
-        <w:trPr>
-          <w:trHeight w:val="326"/>
-        </w:trPr>
-        <w:tc>
-          <w:tcPr>
-            <w:tcW w:w="2934" w:type="dxa"/>
-          </w:tcPr>
-          <w:p>
-            <w:pPr>
-              <w:contextualSpacing/>
-              <w:rPr>
-                <w:sz w:val="24"/>
-                <w:szCs w:val="24"/>
-              </w:rPr>
-            </w:pPr>
-            <w:r>
-              <w:rPr>
-                <w:sz w:val="24"/>
-                <w:szCs w:val="24"/>
-              </w:rPr>
-              <w:t xml:space="preserve">   </w:t>
-            </w:r>
-          </w:p>
-        </w:tc>
-        <w:tc>
-          <w:tcPr>
-            <w:tcW w:w="2683" w:type="dxa"/>
-          </w:tcPr>
-          <w:p>
-            <w:pPr>
-              <w:contextualSpacing/>
-              <w:jc w:val="center"/>
-              <w:rPr>
-                <w:kern w:val="0"/>
-                <w:sz w:val="22"/>
-                <w14:ligatures w14:val="none"/>
-              </w:rPr>
-            </w:pPr>
-          </w:p>
-        </w:tc>
-        <w:tc>
-          <w:tcPr>
-            <w:tcW w:w="2546" w:type="dxa"/>
-          </w:tcPr>
-          <w:p>
-            <w:pPr>
-              <w:contextualSpacing/>
-              <w:jc w:val="center"/>
-              <w:rPr>
-                <w:rStyle w:val="ui-provider"/>
-                <w:kern w:val="0"/>
-                <w:sz w:val="24"/>
-                <w:szCs w:val="24"/>
-                <w14:ligatures w14:val="none"/>
-              </w:rPr>
-            </w:pPr>
-          </w:p>
-        </w:tc>
-        <w:tc>
-          <w:tcPr>
-            <w:tcW w:w="3030" w:type="dxa"/>
-          </w:tcPr>
-          <w:p>
-            <w:pPr>
-              <w:tabs>
-                <w:tab w:val="left" w:pos="340"/>
-              </w:tabs>
-              <w:contextualSpacing/>
-              <w:rPr>
-                <w:rStyle w:val="ui-provider"/>
-                <w:kern w:val="0"/>
-                <w:sz w:val="22"/>
-                <w14:ligatures w14:val="none"/>
-              </w:rPr>
-            </w:pPr>
-          </w:p>
-        </w:tc>
-      </w:tr>
-      <w:tr>
-        <w:trPr>
-          <w:trHeight w:val="326"/>
-        </w:trPr>
-        <w:tc>
-          <w:tcPr>
-            <w:tcW w:w="2934" w:type="dxa"/>
-          </w:tcPr>
-          <w:p>
-            <w:pPr>
-              <w:contextualSpacing/>
-              <w:rPr>
-                <w:sz w:val="22"/>
-              </w:rPr>
-            </w:pPr>
-          </w:p>
-        </w:tc>
-        <w:tc>
-          <w:tcPr>
-            <w:tcW w:w="2683" w:type="dxa"/>
-          </w:tcPr>
-          <w:p>
-            <w:pPr>
-              <w:contextualSpacing/>
-              <w:jc w:val="center"/>
-              <w:rPr>
-                <w:kern w:val="0"/>
-                <w:sz w:val="22"/>
-                <w14:ligatures w14:val="none"/>
-              </w:rPr>
-            </w:pPr>
-          </w:p>
-        </w:tc>
-        <w:tc>
-          <w:tcPr>
-            <w:tcW w:w="2546" w:type="dxa"/>
-          </w:tcPr>
-          <w:p>
-            <w:pPr>
-              <w:contextualSpacing/>
-              <w:jc w:val="center"/>
-              <w:rPr>
-                <w:rStyle w:val="ui-provider"/>
-                <w:kern w:val="0"/>
-                <w:sz w:val="22"/>
-                <w14:ligatures w14:val="none"/>
-              </w:rPr>
-            </w:pPr>
-          </w:p>
-        </w:tc>
-        <w:tc>
-          <w:tcPr>
-            <w:tcW w:w="3030" w:type="dxa"/>
-          </w:tcPr>
-          <w:p>
-            <w:pPr>
-              <w:tabs>
-                <w:tab w:val="left" w:pos="340"/>
-              </w:tabs>
-              <w:contextualSpacing/>
-              <w:jc w:val="center"/>
-              <w:rPr>
-                <w:rStyle w:val="ui-provider"/>
-                <w:kern w:val="0"/>
-                <w:sz w:val="22"/>
-                <w14:ligatures w14:val="none"/>
-              </w:rPr>
-            </w:pPr>
-          </w:p>
-        </w:tc>
-      </w:tr>
-      <w:tr>
-        <w:trPr>
-          <w:trHeight w:val="326"/>
-        </w:trPr>
-        <w:tc>
-          <w:tcPr>
-            <w:tcW w:w="2934" w:type="dxa"/>
-          </w:tcPr>
-          <w:p>
-            <w:pPr>
-              <w:contextualSpacing/>
-              <w:rPr>
-                <w:sz w:val="22"/>
-              </w:rPr>
-            </w:pPr>
-          </w:p>
-        </w:tc>
-        <w:tc>
-          <w:tcPr>
-            <w:tcW w:w="2683" w:type="dxa"/>
-          </w:tcPr>
-          <w:p>
-            <w:pPr>
-              <w:contextualSpacing/>
-              <w:jc w:val="center"/>
-              <w:rPr>
-                <w:kern w:val="0"/>
-                <w:sz w:val="22"/>
-                <w14:ligatures w14:val="none"/>
-              </w:rPr>
-            </w:pPr>
-          </w:p>
-        </w:tc>
-        <w:tc>
-          <w:tcPr>
-            <w:tcW w:w="2546" w:type="dxa"/>
-          </w:tcPr>
-          <w:p>
-            <w:pPr>
-              <w:contextualSpacing/>
-              <w:jc w:val="center"/>
-              <w:rPr>
-                <w:rStyle w:val="ui-provider"/>
-                <w:kern w:val="0"/>
-                <w:sz w:val="22"/>
-                <w14:ligatures w14:val="none"/>
-              </w:rPr>
-            </w:pPr>
-          </w:p>
-        </w:tc>
-        <w:tc>
-          <w:tcPr>
-            <w:tcW w:w="3030" w:type="dxa"/>
-          </w:tcPr>
-          <w:p>
-            <w:pPr>
-              <w:tabs>
-                <w:tab w:val="left" w:pos="340"/>
-              </w:tabs>
-              <w:contextualSpacing/>
-              <w:jc w:val="center"/>
-              <w:rPr>
-                <w:rStyle w:val="ui-provider"/>
-                <w:kern w:val="0"/>
-                <w:sz w:val="22"/>
-                <w14:ligatures w14:val="none"/>
-              </w:rPr>
-            </w:pPr>
           </w:p>
         </w:tc>
       </w:tr>
@@ -1709,6 +1312,7 @@
     </w:p>
     <w:p>
       <w:pPr>
+        <w:jc w:val="center"/>
         <w:rPr>
           <w:color w:val="000000" w:themeColor="text1"/>
           <w:sz w:val="24"/>
@@ -1745,6 +1349,27 @@
           <w:sz w:val="22"/>
         </w:rPr>
       </w:pPr>
+    </w:p>
+    <w:p>
+      <w:pPr>
+        <w:rPr>
+          <w:b/>
+          <w:bCs/>
+          <w:noProof/>
+          <w:sz w:val="24"/>
+          <w:szCs w:val="24"/>
+        </w:rPr>
+      </w:pPr>
+      <w:r>
+        <w:rPr>
+          <w:b/>
+          <w:bCs/>
+          <w:noProof/>
+          <w:sz w:val="24"/>
+          <w:szCs w:val="24"/>
+        </w:rPr>
+        <w:t xml:space="preserve">  </w:t>
+      </w:r>
     </w:p>
     <w:p>
       <w:pPr>
@@ -1889,8 +1514,8 @@
       </w:tblPr>
       <w:tblGrid>
         <w:gridCol w:w="5125"/>
-        <w:gridCol w:w="3965"/>
-        <w:gridCol w:w="4500"/>
+        <w:gridCol w:w="4140"/>
+        <w:gridCol w:w="4325"/>
       </w:tblGrid>
       <w:tr>
         <w:trPr>
@@ -1916,9 +1541,9 @@
                 <w:sz w:val="24"/>
                 <w:szCs w:val="24"/>
               </w:rPr>
-              <w:t xml:space="preserve">  </w:t>
-            </w:r>
-            <w:proofErr w:type="gramStart"/>
+              <w:t xml:space="preserve">     Registration:</w:t>
+            </w:r>
+            <w:bookmarkStart w:id="15" w:name="OLE_LINK9"/>
             <w:r>
               <w:rPr>
                 <w:b/>
@@ -1927,28 +1552,16 @@
                 <w:sz w:val="24"/>
                 <w:szCs w:val="24"/>
               </w:rPr>
-              <w:t>Registration:</w:t>
-            </w:r>
-            <w:bookmarkStart w:id="15" w:name="OLE_LINK9"/>
-            <w:r>
-              <w:rPr>
-                <w:b/>
-                <w:bCs/>
+              <w:t xml:space="preserve"> </w:t>
+            </w:r>
+            <w:r>
+              <w:rPr>
                 <w:color w:val="000000" w:themeColor="text1"/>
-                <w:sz w:val="24"/>
-                <w:szCs w:val="24"/>
-              </w:rPr>
-              <w:t xml:space="preserve"> </w:t>
-            </w:r>
-            <w:r>
-              <w:rPr>
-                <w:color w:val="000000" w:themeColor="text1"/>
                 <w:sz w:val="22"/>
               </w:rPr>
               <w:t>{{</w:t>
             </w:r>
             <w:proofErr w:type="spellStart"/>
-            <w:proofErr w:type="gramEnd"/>
             <w:r>
               <w:rPr>
                 <w:color w:val="000000" w:themeColor="text1"/>
@@ -1969,7 +1582,7 @@
         </w:tc>
         <w:tc>
           <w:tcPr>
-            <w:tcW w:w="3965" w:type="dxa"/>
+            <w:tcW w:w="4140" w:type="dxa"/>
             <w:hideMark/>
           </w:tcPr>
           <w:p>
@@ -1987,23 +1600,13 @@
                 <w:sz w:val="24"/>
                 <w:szCs w:val="24"/>
               </w:rPr>
-              <w:t xml:space="preserve">                                  Invoice total:</w:t>
-            </w:r>
-            <w:r>
-              <w:rPr>
-                <w:b/>
-                <w:bCs/>
-                <w:color w:val="000000" w:themeColor="text1"/>
-                <w:sz w:val="24"/>
-                <w:szCs w:val="24"/>
-              </w:rPr>
-              <w:t xml:space="preserve">       </w:t>
+              <w:t xml:space="preserve">                                     Invoice total:</w:t>
             </w:r>
           </w:p>
         </w:tc>
         <w:tc>
           <w:tcPr>
-            <w:tcW w:w="4500" w:type="dxa"/>
+            <w:tcW w:w="4325" w:type="dxa"/>
           </w:tcPr>
           <w:p>
             <w:pPr>
@@ -2085,7 +1688,7 @@
         </w:tc>
         <w:tc>
           <w:tcPr>
-            <w:tcW w:w="3965" w:type="dxa"/>
+            <w:tcW w:w="4140" w:type="dxa"/>
             <w:hideMark/>
           </w:tcPr>
           <w:p>
@@ -2107,13 +1710,13 @@
                 <w:szCs w:val="24"/>
                 <w14:ligatures w14:val="none"/>
               </w:rPr>
-              <w:t xml:space="preserve">                                  Balance due:</w:t>
+              <w:t xml:space="preserve">                                     Balance due:</w:t>
             </w:r>
           </w:p>
         </w:tc>
         <w:tc>
           <w:tcPr>
-            <w:tcW w:w="4500" w:type="dxa"/>
+            <w:tcW w:w="4325" w:type="dxa"/>
           </w:tcPr>
           <w:p>
             <w:pPr>
@@ -2171,6 +1774,20 @@
           <w:sz w:val="22"/>
         </w:rPr>
       </w:pPr>
+      <w:r>
+        <w:rPr>
+          <w:noProof/>
+          <w:sz w:val="22"/>
+        </w:rPr>
+        <w:t xml:space="preserve">  </w:t>
+      </w:r>
+      <w:r>
+        <w:rPr>
+          <w:noProof/>
+          <w:sz w:val="22"/>
+        </w:rPr>
+        <w:tab/>
+      </w:r>
     </w:p>
     <w:sectPr>
       <w:type w:val="continuous"/>
@@ -3113,7 +2730,6 @@
   <w:style w:type="character" w:default="1" w:styleId="DefaultParagraphFont">
     <w:name w:val="Default Paragraph Font"/>
     <w:uiPriority w:val="1"/>
-    <w:semiHidden/>
     <w:unhideWhenUsed/>
   </w:style>
   <w:style w:type="table" w:default="1" w:styleId="TableNormal">

</xml_diff>

<commit_message>
updating DocGen Templates from release-phocs-prod-18.1.0
</commit_message>
<xml_diff>
--- a/ALR-DocgenTemplates/InvoiceTemplate.docx
+++ b/ALR-DocgenTemplates/InvoiceTemplate.docx
@@ -12,12 +12,8 @@
           <w:szCs w:val="34"/>
         </w:rPr>
         <w:sectPr>
-          <w:headerReference w:type="even" r:id="rId6"/>
-          <w:headerReference w:type="default" r:id="rId7"/>
-          <w:footerReference w:type="even" r:id="rId8"/>
-          <w:footerReference w:type="default" r:id="rId9"/>
-          <w:headerReference w:type="first" r:id="rId10"/>
-          <w:footerReference w:type="first" r:id="rId11"/>
+          <w:headerReference w:type="default" r:id="rId6"/>
+          <w:footerReference w:type="default" r:id="rId7"/>
           <w:pgSz w:w="12240" w:h="15840"/>
           <w:pgMar w:top="720" w:right="720" w:bottom="720" w:left="720" w:header="708" w:footer="708" w:gutter="0"/>
           <w:cols w:space="708"/>
@@ -661,28 +657,28 @@
               </w:rPr>
             </w:pPr>
             <w:bookmarkStart w:id="4" w:name="OLE_LINK8"/>
+            <w:r>
+              <w:rPr>
+                <w:rStyle w:val="ui-provider"/>
+                <w:sz w:val="22"/>
+              </w:rPr>
+              <w:t>{{</w:t>
+            </w:r>
+            <w:proofErr w:type="spellStart"/>
+            <w:r>
+              <w:rPr>
+                <w:rStyle w:val="ui-provider"/>
+                <w:sz w:val="22"/>
+              </w:rPr>
+              <w:t>PublicFeeSum</w:t>
+            </w:r>
+            <w:proofErr w:type="spellEnd"/>
             <w:proofErr w:type="gramStart"/>
             <w:r>
               <w:rPr>
                 <w:rStyle w:val="ui-provider"/>
                 <w:sz w:val="22"/>
               </w:rPr>
-              <w:t>{{</w:t>
-            </w:r>
-            <w:proofErr w:type="spellStart"/>
-            <w:r>
-              <w:rPr>
-                <w:rStyle w:val="ui-provider"/>
-                <w:sz w:val="22"/>
-              </w:rPr>
-              <w:t>PublicFeeSum</w:t>
-            </w:r>
-            <w:proofErr w:type="spellEnd"/>
-            <w:r>
-              <w:rPr>
-                <w:rStyle w:val="ui-provider"/>
-                <w:sz w:val="22"/>
-              </w:rPr>
               <w:t>}}</w:t>
             </w:r>
             <w:bookmarkStart w:id="5" w:name="OLE_LINK27"/>
@@ -691,7 +687,7 @@
                 <w:rStyle w:val="ui-provider"/>
                 <w:sz w:val="22"/>
               </w:rPr>
-              <w:t>{{/</w:t>
+              <w:t>{</w:t>
             </w:r>
             <w:proofErr w:type="gramEnd"/>
             <w:r>
@@ -699,7 +695,7 @@
                 <w:rStyle w:val="ui-provider"/>
                 <w:sz w:val="22"/>
               </w:rPr>
-              <w:t>P</w:t>
+              <w:t>{/P</w:t>
             </w:r>
             <w:r>
               <w:rPr>
@@ -855,6 +851,26 @@
                 <w:sz w:val="22"/>
               </w:rPr>
             </w:pPr>
+            <w:r>
+              <w:rPr>
+                <w:rStyle w:val="ui-provider"/>
+                <w:kern w:val="0"/>
+                <w:sz w:val="22"/>
+                <w14:ligatures w14:val="none"/>
+              </w:rPr>
+              <w:t>{{</w:t>
+            </w:r>
+            <w:proofErr w:type="spellStart"/>
+            <w:r>
+              <w:rPr>
+                <w:rStyle w:val="ui-provider"/>
+                <w:kern w:val="0"/>
+                <w:sz w:val="22"/>
+                <w14:ligatures w14:val="none"/>
+              </w:rPr>
+              <w:t>PrivateFeeSum</w:t>
+            </w:r>
+            <w:proofErr w:type="spellEnd"/>
             <w:proofErr w:type="gramStart"/>
             <w:r>
               <w:rPr>
@@ -863,26 +879,6 @@
                 <w:sz w:val="22"/>
                 <w14:ligatures w14:val="none"/>
               </w:rPr>
-              <w:t>{{</w:t>
-            </w:r>
-            <w:proofErr w:type="spellStart"/>
-            <w:r>
-              <w:rPr>
-                <w:rStyle w:val="ui-provider"/>
-                <w:kern w:val="0"/>
-                <w:sz w:val="22"/>
-                <w14:ligatures w14:val="none"/>
-              </w:rPr>
-              <w:t>PrivateFeeSum</w:t>
-            </w:r>
-            <w:proofErr w:type="spellEnd"/>
-            <w:r>
-              <w:rPr>
-                <w:rStyle w:val="ui-provider"/>
-                <w:kern w:val="0"/>
-                <w:sz w:val="22"/>
-                <w14:ligatures w14:val="none"/>
-              </w:rPr>
               <w:t>}}</w:t>
             </w:r>
             <w:bookmarkStart w:id="8" w:name="OLE_LINK28"/>
@@ -893,7 +889,7 @@
                 <w:sz w:val="22"/>
                 <w14:ligatures w14:val="none"/>
               </w:rPr>
-              <w:t>{{/</w:t>
+              <w:t>{</w:t>
             </w:r>
             <w:proofErr w:type="gramEnd"/>
             <w:r>
@@ -903,7 +899,7 @@
                 <w:sz w:val="22"/>
                 <w14:ligatures w14:val="none"/>
               </w:rPr>
-              <w:t>Private}}</w:t>
+              <w:t>{/Private}}</w:t>
             </w:r>
             <w:bookmarkEnd w:id="8"/>
           </w:p>
@@ -937,7 +933,16 @@
                 <w:sz w:val="22"/>
                 <w14:ligatures w14:val="none"/>
               </w:rPr>
-              <w:t>Per Diem</w:t>
+              <w:t xml:space="preserve">Per </w:t>
+            </w:r>
+            <w:proofErr w:type="gramStart"/>
+            <w:r>
+              <w:rPr>
+                <w:kern w:val="0"/>
+                <w:sz w:val="22"/>
+                <w14:ligatures w14:val="none"/>
+              </w:rPr>
+              <w:t>Diem</w:t>
             </w:r>
             <w:bookmarkEnd w:id="9"/>
             <w:r>
@@ -947,7 +952,17 @@
                 <w:sz w:val="22"/>
                 <w14:ligatures w14:val="none"/>
               </w:rPr>
-              <w:t>{{#</w:t>
+              <w:t>{</w:t>
+            </w:r>
+            <w:proofErr w:type="gramEnd"/>
+            <w:r>
+              <w:rPr>
+                <w:rStyle w:val="ui-provider"/>
+                <w:kern w:val="0"/>
+                <w:sz w:val="22"/>
+                <w14:ligatures w14:val="none"/>
+              </w:rPr>
+              <w:t>{#</w:t>
             </w:r>
             <w:r>
               <w:rPr>
@@ -1106,6 +1121,7 @@
               </w:rPr>
               <w:t>{{</w:t>
             </w:r>
+            <w:proofErr w:type="spellStart"/>
             <w:r>
               <w:rPr>
                 <w:kern w:val="0"/>
@@ -1121,7 +1137,18 @@
                 <w:sz w:val="22"/>
                 <w14:ligatures w14:val="none"/>
               </w:rPr>
-              <w:t>Sum}}</w:t>
+              <w:t>Sum</w:t>
+            </w:r>
+            <w:proofErr w:type="spellEnd"/>
+            <w:proofErr w:type="gramStart"/>
+            <w:r>
+              <w:rPr>
+                <w:rStyle w:val="ui-provider"/>
+                <w:kern w:val="0"/>
+                <w:sz w:val="22"/>
+                <w14:ligatures w14:val="none"/>
+              </w:rPr>
+              <w:t>}}</w:t>
             </w:r>
             <w:bookmarkStart w:id="14" w:name="OLE_LINK29"/>
             <w:r>
@@ -1131,7 +1158,17 @@
                 <w:sz w:val="22"/>
                 <w14:ligatures w14:val="none"/>
               </w:rPr>
-              <w:t>{{/</w:t>
+              <w:t>{</w:t>
+            </w:r>
+            <w:proofErr w:type="gramEnd"/>
+            <w:r>
+              <w:rPr>
+                <w:rStyle w:val="ui-provider"/>
+                <w:kern w:val="0"/>
+                <w:sz w:val="22"/>
+                <w14:ligatures w14:val="none"/>
+              </w:rPr>
+              <w:t>{/</w:t>
             </w:r>
             <w:r>
               <w:rPr>
@@ -1504,32 +1541,39 @@
                 <w:sz w:val="24"/>
                 <w:szCs w:val="24"/>
               </w:rPr>
-              <w:t xml:space="preserve">     Registration: </w:t>
+              <w:t xml:space="preserve">     Registration:</w:t>
             </w:r>
             <w:bookmarkStart w:id="15" w:name="OLE_LINK9"/>
             <w:r>
               <w:rPr>
+                <w:b/>
+                <w:bCs/>
                 <w:color w:val="000000" w:themeColor="text1"/>
                 <w:sz w:val="24"/>
                 <w:szCs w:val="24"/>
               </w:rPr>
+              <w:t xml:space="preserve"> </w:t>
+            </w:r>
+            <w:r>
+              <w:rPr>
+                <w:color w:val="000000" w:themeColor="text1"/>
+                <w:sz w:val="22"/>
+              </w:rPr>
               <w:t>{{</w:t>
             </w:r>
             <w:proofErr w:type="spellStart"/>
             <w:r>
               <w:rPr>
                 <w:color w:val="000000" w:themeColor="text1"/>
-                <w:sz w:val="24"/>
-                <w:szCs w:val="24"/>
-              </w:rPr>
-              <w:t>CertificateId</w:t>
+                <w:sz w:val="22"/>
+              </w:rPr>
+              <w:t>IF_isCertificateIdNotPresent</w:t>
             </w:r>
             <w:proofErr w:type="spellEnd"/>
             <w:r>
               <w:rPr>
                 <w:color w:val="000000" w:themeColor="text1"/>
-                <w:sz w:val="24"/>
-                <w:szCs w:val="24"/>
+                <w:sz w:val="22"/>
               </w:rPr>
               <w:t>}}</w:t>
             </w:r>
@@ -1785,16 +1829,6 @@
 <w:ftr xmlns:wpc="http://schemas.microsoft.com/office/word/2010/wordprocessingCanvas" xmlns:cx="http://schemas.microsoft.com/office/drawing/2014/chartex" xmlns:cx1="http://schemas.microsoft.com/office/drawing/2015/9/8/chartex" xmlns:cx2="http://schemas.microsoft.com/office/drawing/2015/10/21/chartex" xmlns:cx3="http://schemas.microsoft.com/office/drawing/2016/5/9/chartex" xmlns:cx4="http://schemas.microsoft.com/office/drawing/2016/5/10/chartex" xmlns:cx5="http://schemas.microsoft.com/office/drawing/2016/5/11/chartex" xmlns:cx6="http://schemas.microsoft.com/office/drawing/2016/5/12/chartex" xmlns:cx7="http://schemas.microsoft.com/office/drawing/2016/5/13/chartex" xmlns:cx8="http://schemas.microsoft.com/office/drawing/2016/5/14/chartex" xmlns:mc="http://schemas.openxmlformats.org/markup-compatibility/2006" xmlns:aink="http://schemas.microsoft.com/office/drawing/2016/ink" xmlns:am3d="http://schemas.microsoft.com/office/drawing/2017/model3d" xmlns:o="urn:schemas-microsoft-com:office:office" xmlns:oel="http://schemas.microsoft.com/office/2019/extlst" xmlns:r="http://schemas.openxmlformats.org/officeDocument/2006/relationships" xmlns:m="http://schemas.openxmlformats.org/officeDocument/2006/math" xmlns:v="urn:schemas-microsoft-com:vml" xmlns:wp14="http://schemas.microsoft.com/office/word/2010/wordprocessingDrawing" xmlns:wp="http://schemas.openxmlformats.org/drawingml/2006/wordprocessingDrawing" xmlns:w10="urn:schemas-microsoft-com:office:word" xmlns:w="http://schemas.openxmlformats.org/wordprocessingml/2006/main" xmlns:w14="http://schemas.microsoft.com/office/word/2010/wordml" xmlns:w15="http://schemas.microsoft.com/office/word/2012/wordml" xmlns:w16cex="http://schemas.microsoft.com/office/word/2018/wordml/cex" xmlns:w16cid="http://schemas.microsoft.com/office/word/2016/wordml/cid" xmlns:w16="http://schemas.microsoft.com/office/word/2018/wordml" xmlns:w16du="http://schemas.microsoft.com/office/word/2023/wordml/word16du" xmlns:w16sdtdh="http://schemas.microsoft.com/office/word/2020/wordml/sdtdatahash" xmlns:w16sdtfl="http://schemas.microsoft.com/office/word/2024/wordml/sdtformatlock" xmlns:w16se="http://schemas.microsoft.com/office/word/2015/wordml/symex" xmlns:wpg="http://schemas.microsoft.com/office/word/2010/wordprocessingGroup" xmlns:wpi="http://schemas.microsoft.com/office/word/2010/wordprocessingInk" xmlns:wne="http://schemas.microsoft.com/office/word/2006/wordml" xmlns:wps="http://schemas.microsoft.com/office/word/2010/wordprocessingShape" mc:Ignorable="w14 w15 w16se w16cid w16 w16cex w16sdtdh w16sdtfl w16du wp14">
   <w:p>
     <w:pPr>
-      <w:pStyle w:val="Footer"/>
-    </w:pPr>
-  </w:p>
-</w:ftr>
-</file>
-
-<file path=word/footer2.xml><?xml version="1.0" encoding="utf-8"?>
-<w:ftr xmlns:wpc="http://schemas.microsoft.com/office/word/2010/wordprocessingCanvas" xmlns:cx="http://schemas.microsoft.com/office/drawing/2014/chartex" xmlns:cx1="http://schemas.microsoft.com/office/drawing/2015/9/8/chartex" xmlns:cx2="http://schemas.microsoft.com/office/drawing/2015/10/21/chartex" xmlns:cx3="http://schemas.microsoft.com/office/drawing/2016/5/9/chartex" xmlns:cx4="http://schemas.microsoft.com/office/drawing/2016/5/10/chartex" xmlns:cx5="http://schemas.microsoft.com/office/drawing/2016/5/11/chartex" xmlns:cx6="http://schemas.microsoft.com/office/drawing/2016/5/12/chartex" xmlns:cx7="http://schemas.microsoft.com/office/drawing/2016/5/13/chartex" xmlns:cx8="http://schemas.microsoft.com/office/drawing/2016/5/14/chartex" xmlns:mc="http://schemas.openxmlformats.org/markup-compatibility/2006" xmlns:aink="http://schemas.microsoft.com/office/drawing/2016/ink" xmlns:am3d="http://schemas.microsoft.com/office/drawing/2017/model3d" xmlns:o="urn:schemas-microsoft-com:office:office" xmlns:oel="http://schemas.microsoft.com/office/2019/extlst" xmlns:r="http://schemas.openxmlformats.org/officeDocument/2006/relationships" xmlns:m="http://schemas.openxmlformats.org/officeDocument/2006/math" xmlns:v="urn:schemas-microsoft-com:vml" xmlns:wp14="http://schemas.microsoft.com/office/word/2010/wordprocessingDrawing" xmlns:wp="http://schemas.openxmlformats.org/drawingml/2006/wordprocessingDrawing" xmlns:w10="urn:schemas-microsoft-com:office:word" xmlns:w="http://schemas.openxmlformats.org/wordprocessingml/2006/main" xmlns:w14="http://schemas.microsoft.com/office/word/2010/wordml" xmlns:w15="http://schemas.microsoft.com/office/word/2012/wordml" xmlns:w16cex="http://schemas.microsoft.com/office/word/2018/wordml/cex" xmlns:w16cid="http://schemas.microsoft.com/office/word/2016/wordml/cid" xmlns:w16="http://schemas.microsoft.com/office/word/2018/wordml" xmlns:w16du="http://schemas.microsoft.com/office/word/2023/wordml/word16du" xmlns:w16sdtdh="http://schemas.microsoft.com/office/word/2020/wordml/sdtdatahash" xmlns:w16sdtfl="http://schemas.microsoft.com/office/word/2024/wordml/sdtformatlock" xmlns:w16se="http://schemas.microsoft.com/office/word/2015/wordml/symex" xmlns:wpg="http://schemas.microsoft.com/office/word/2010/wordprocessingGroup" xmlns:wpi="http://schemas.microsoft.com/office/word/2010/wordprocessingInk" xmlns:wne="http://schemas.microsoft.com/office/word/2006/wordml" xmlns:wps="http://schemas.microsoft.com/office/word/2010/wordprocessingShape" mc:Ignorable="w14 w15 w16se w16cid w16 w16cex w16sdtdh w16sdtfl w16du wp14">
-  <w:p>
-    <w:pPr>
       <w:jc w:val="right"/>
       <w:rPr>
         <w:noProof/>
@@ -1899,16 +1933,6 @@
       </w:rPr>
       <w:t xml:space="preserve"> (250) 953-0496</w:t>
     </w:r>
-  </w:p>
-</w:ftr>
-</file>
-
-<file path=word/footer3.xml><?xml version="1.0" encoding="utf-8"?>
-<w:ftr xmlns:wpc="http://schemas.microsoft.com/office/word/2010/wordprocessingCanvas" xmlns:cx="http://schemas.microsoft.com/office/drawing/2014/chartex" xmlns:cx1="http://schemas.microsoft.com/office/drawing/2015/9/8/chartex" xmlns:cx2="http://schemas.microsoft.com/office/drawing/2015/10/21/chartex" xmlns:cx3="http://schemas.microsoft.com/office/drawing/2016/5/9/chartex" xmlns:cx4="http://schemas.microsoft.com/office/drawing/2016/5/10/chartex" xmlns:cx5="http://schemas.microsoft.com/office/drawing/2016/5/11/chartex" xmlns:cx6="http://schemas.microsoft.com/office/drawing/2016/5/12/chartex" xmlns:cx7="http://schemas.microsoft.com/office/drawing/2016/5/13/chartex" xmlns:cx8="http://schemas.microsoft.com/office/drawing/2016/5/14/chartex" xmlns:mc="http://schemas.openxmlformats.org/markup-compatibility/2006" xmlns:aink="http://schemas.microsoft.com/office/drawing/2016/ink" xmlns:am3d="http://schemas.microsoft.com/office/drawing/2017/model3d" xmlns:o="urn:schemas-microsoft-com:office:office" xmlns:oel="http://schemas.microsoft.com/office/2019/extlst" xmlns:r="http://schemas.openxmlformats.org/officeDocument/2006/relationships" xmlns:m="http://schemas.openxmlformats.org/officeDocument/2006/math" xmlns:v="urn:schemas-microsoft-com:vml" xmlns:wp14="http://schemas.microsoft.com/office/word/2010/wordprocessingDrawing" xmlns:wp="http://schemas.openxmlformats.org/drawingml/2006/wordprocessingDrawing" xmlns:w10="urn:schemas-microsoft-com:office:word" xmlns:w="http://schemas.openxmlformats.org/wordprocessingml/2006/main" xmlns:w14="http://schemas.microsoft.com/office/word/2010/wordml" xmlns:w15="http://schemas.microsoft.com/office/word/2012/wordml" xmlns:w16cex="http://schemas.microsoft.com/office/word/2018/wordml/cex" xmlns:w16cid="http://schemas.microsoft.com/office/word/2016/wordml/cid" xmlns:w16="http://schemas.microsoft.com/office/word/2018/wordml" xmlns:w16du="http://schemas.microsoft.com/office/word/2023/wordml/word16du" xmlns:w16sdtdh="http://schemas.microsoft.com/office/word/2020/wordml/sdtdatahash" xmlns:w16sdtfl="http://schemas.microsoft.com/office/word/2024/wordml/sdtformatlock" xmlns:w16se="http://schemas.microsoft.com/office/word/2015/wordml/symex" xmlns:wpg="http://schemas.microsoft.com/office/word/2010/wordprocessingGroup" xmlns:wpi="http://schemas.microsoft.com/office/word/2010/wordprocessingInk" xmlns:wne="http://schemas.microsoft.com/office/word/2006/wordml" xmlns:wps="http://schemas.microsoft.com/office/word/2010/wordprocessingShape" mc:Ignorable="w14 w15 w16se w16cid w16 w16cex w16sdtdh w16sdtfl w16du wp14">
-  <w:p>
-    <w:pPr>
-      <w:pStyle w:val="Footer"/>
-    </w:pPr>
   </w:p>
 </w:ftr>
 </file>
@@ -1939,16 +1963,6 @@
 </file>
 
 <file path=word/header1.xml><?xml version="1.0" encoding="utf-8"?>
-<w:hdr xmlns:wpc="http://schemas.microsoft.com/office/word/2010/wordprocessingCanvas" xmlns:cx="http://schemas.microsoft.com/office/drawing/2014/chartex" xmlns:cx1="http://schemas.microsoft.com/office/drawing/2015/9/8/chartex" xmlns:cx2="http://schemas.microsoft.com/office/drawing/2015/10/21/chartex" xmlns:cx3="http://schemas.microsoft.com/office/drawing/2016/5/9/chartex" xmlns:cx4="http://schemas.microsoft.com/office/drawing/2016/5/10/chartex" xmlns:cx5="http://schemas.microsoft.com/office/drawing/2016/5/11/chartex" xmlns:cx6="http://schemas.microsoft.com/office/drawing/2016/5/12/chartex" xmlns:cx7="http://schemas.microsoft.com/office/drawing/2016/5/13/chartex" xmlns:cx8="http://schemas.microsoft.com/office/drawing/2016/5/14/chartex" xmlns:mc="http://schemas.openxmlformats.org/markup-compatibility/2006" xmlns:aink="http://schemas.microsoft.com/office/drawing/2016/ink" xmlns:am3d="http://schemas.microsoft.com/office/drawing/2017/model3d" xmlns:o="urn:schemas-microsoft-com:office:office" xmlns:oel="http://schemas.microsoft.com/office/2019/extlst" xmlns:r="http://schemas.openxmlformats.org/officeDocument/2006/relationships" xmlns:m="http://schemas.openxmlformats.org/officeDocument/2006/math" xmlns:v="urn:schemas-microsoft-com:vml" xmlns:wp14="http://schemas.microsoft.com/office/word/2010/wordprocessingDrawing" xmlns:wp="http://schemas.openxmlformats.org/drawingml/2006/wordprocessingDrawing" xmlns:w10="urn:schemas-microsoft-com:office:word" xmlns:w="http://schemas.openxmlformats.org/wordprocessingml/2006/main" xmlns:w14="http://schemas.microsoft.com/office/word/2010/wordml" xmlns:w15="http://schemas.microsoft.com/office/word/2012/wordml" xmlns:w16cex="http://schemas.microsoft.com/office/word/2018/wordml/cex" xmlns:w16cid="http://schemas.microsoft.com/office/word/2016/wordml/cid" xmlns:w16="http://schemas.microsoft.com/office/word/2018/wordml" xmlns:w16du="http://schemas.microsoft.com/office/word/2023/wordml/word16du" xmlns:w16sdtdh="http://schemas.microsoft.com/office/word/2020/wordml/sdtdatahash" xmlns:w16sdtfl="http://schemas.microsoft.com/office/word/2024/wordml/sdtformatlock" xmlns:w16se="http://schemas.microsoft.com/office/word/2015/wordml/symex" xmlns:wpg="http://schemas.microsoft.com/office/word/2010/wordprocessingGroup" xmlns:wpi="http://schemas.microsoft.com/office/word/2010/wordprocessingInk" xmlns:wne="http://schemas.microsoft.com/office/word/2006/wordml" xmlns:wps="http://schemas.microsoft.com/office/word/2010/wordprocessingShape" mc:Ignorable="w14 w15 w16se w16cid w16 w16cex w16sdtdh w16sdtfl w16du wp14">
-  <w:p>
-    <w:pPr>
-      <w:pStyle w:val="Header"/>
-    </w:pPr>
-  </w:p>
-</w:hdr>
-</file>
-
-<file path=word/header2.xml><?xml version="1.0" encoding="utf-8"?>
 <w:hdr xmlns:wpc="http://schemas.microsoft.com/office/word/2010/wordprocessingCanvas" xmlns:cx="http://schemas.microsoft.com/office/drawing/2014/chartex" xmlns:cx1="http://schemas.microsoft.com/office/drawing/2015/9/8/chartex" xmlns:cx2="http://schemas.microsoft.com/office/drawing/2015/10/21/chartex" xmlns:cx3="http://schemas.microsoft.com/office/drawing/2016/5/9/chartex" xmlns:cx4="http://schemas.microsoft.com/office/drawing/2016/5/10/chartex" xmlns:cx5="http://schemas.microsoft.com/office/drawing/2016/5/11/chartex" xmlns:cx6="http://schemas.microsoft.com/office/drawing/2016/5/12/chartex" xmlns:cx7="http://schemas.microsoft.com/office/drawing/2016/5/13/chartex" xmlns:cx8="http://schemas.microsoft.com/office/drawing/2016/5/14/chartex" xmlns:mc="http://schemas.openxmlformats.org/markup-compatibility/2006" xmlns:aink="http://schemas.microsoft.com/office/drawing/2016/ink" xmlns:am3d="http://schemas.microsoft.com/office/drawing/2017/model3d" xmlns:o="urn:schemas-microsoft-com:office:office" xmlns:oel="http://schemas.microsoft.com/office/2019/extlst" xmlns:r="http://schemas.openxmlformats.org/officeDocument/2006/relationships" xmlns:m="http://schemas.openxmlformats.org/officeDocument/2006/math" xmlns:v="urn:schemas-microsoft-com:vml" xmlns:wp14="http://schemas.microsoft.com/office/word/2010/wordprocessingDrawing" xmlns:wp="http://schemas.openxmlformats.org/drawingml/2006/wordprocessingDrawing" xmlns:w10="urn:schemas-microsoft-com:office:word" xmlns:w="http://schemas.openxmlformats.org/wordprocessingml/2006/main" xmlns:w14="http://schemas.microsoft.com/office/word/2010/wordml" xmlns:w15="http://schemas.microsoft.com/office/word/2012/wordml" xmlns:w16cex="http://schemas.microsoft.com/office/word/2018/wordml/cex" xmlns:w16cid="http://schemas.microsoft.com/office/word/2016/wordml/cid" xmlns:w16="http://schemas.microsoft.com/office/word/2018/wordml" xmlns:w16du="http://schemas.microsoft.com/office/word/2023/wordml/word16du" xmlns:w16sdtdh="http://schemas.microsoft.com/office/word/2020/wordml/sdtdatahash" xmlns:w16sdtfl="http://schemas.microsoft.com/office/word/2024/wordml/sdtformatlock" xmlns:w16se="http://schemas.microsoft.com/office/word/2015/wordml/symex" xmlns:wpg="http://schemas.microsoft.com/office/word/2010/wordprocessingGroup" xmlns:wpi="http://schemas.microsoft.com/office/word/2010/wordprocessingInk" xmlns:wne="http://schemas.microsoft.com/office/word/2006/wordml" xmlns:wps="http://schemas.microsoft.com/office/word/2010/wordprocessingShape" mc:Ignorable="w14 w15 w16se w16cid w16 w16cex w16sdtdh w16sdtfl w16du wp14">
   <w:p>
     <w:pPr>
@@ -2087,57 +2101,65 @@
         <w:b/>
         <w:bCs/>
         <w:noProof/>
-        <w:sz w:val="28"/>
-        <w:szCs w:val="28"/>
-      </w:rPr>
-      <w:t xml:space="preserve">     </w:t>
+        <w:sz w:val="22"/>
+      </w:rPr>
+      <w:t xml:space="preserve">        </w:t>
     </w:r>
     <w:bookmarkStart w:id="0" w:name="OLE_LINK2"/>
     <w:r>
       <w:rPr>
         <w:b/>
         <w:bCs/>
-        <w:sz w:val="28"/>
-        <w:szCs w:val="28"/>
-      </w:rPr>
-      <w:t>Invoice #:</w:t>
+        <w:sz w:val="30"/>
+        <w:szCs w:val="30"/>
+      </w:rPr>
+      <w:t xml:space="preserve">Invoice </w:t>
     </w:r>
     <w:r>
       <w:rPr>
         <w:b/>
         <w:bCs/>
-        <w:sz w:val="28"/>
-        <w:szCs w:val="28"/>
-      </w:rPr>
-      <w:t xml:space="preserve"> </w:t>
-    </w:r>
-    <w:bookmarkEnd w:id="0"/>
+        <w:sz w:val="30"/>
+        <w:szCs w:val="32"/>
+      </w:rPr>
+      <w:t>#:</w:t>
+    </w:r>
     <w:r>
       <w:rPr>
         <w:b/>
         <w:bCs/>
-        <w:sz w:val="28"/>
-        <w:szCs w:val="28"/>
-      </w:rPr>
-      <w:t>{{</w:t>
-    </w:r>
-    <w:proofErr w:type="spellStart"/>
+        <w:sz w:val="30"/>
+        <w:szCs w:val="32"/>
+      </w:rPr>
+      <w:t xml:space="preserve"> </w:t>
+    </w:r>
+    <w:bookmarkEnd w:id="0"/>
     <w:r>
       <w:rPr>
         <w:b/>
         <w:bCs/>
-        <w:sz w:val="28"/>
-        <w:szCs w:val="28"/>
-      </w:rPr>
-      <w:t>InvoiceId</w:t>
-    </w:r>
-    <w:proofErr w:type="spellEnd"/>
+        <w:sz w:val="30"/>
+        <w:szCs w:val="30"/>
+      </w:rPr>
+      <w:t>{{</w:t>
+    </w:r>
+    <w:proofErr w:type="spellStart"/>
     <w:r>
       <w:rPr>
         <w:b/>
         <w:bCs/>
-        <w:sz w:val="28"/>
-        <w:szCs w:val="28"/>
+        <w:sz w:val="30"/>
+        <w:szCs w:val="30"/>
+      </w:rPr>
+      <w:t>InvoiceId</w:t>
+    </w:r>
+    <w:proofErr w:type="spellEnd"/>
+    <w:r>
+      <w:rPr>
+        <w:b/>
+        <w:bCs/>
+        <w:sz w:val="30"/>
+        <w:szCs w:val="30"/>
       </w:rPr>
       <w:t>}}</w:t>
     </w:r>
@@ -2186,6 +2208,15 @@
         <w:sz w:val="22"/>
       </w:rPr>
       <w:t xml:space="preserve">  </w:t>
+    </w:r>
+    <w:r>
+      <w:rPr>
+        <w:i/>
+        <w:iCs/>
+        <w:noProof/>
+        <w:sz w:val="22"/>
+      </w:rPr>
+      <w:t xml:space="preserve">   </w:t>
     </w:r>
     <w:r>
       <w:rPr>
@@ -2291,16 +2322,6 @@
         <w:noProof/>
         <w:sz w:val="22"/>
       </w:rPr>
-    </w:pPr>
-  </w:p>
-</w:hdr>
-</file>
-
-<file path=word/header3.xml><?xml version="1.0" encoding="utf-8"?>
-<w:hdr xmlns:wpc="http://schemas.microsoft.com/office/word/2010/wordprocessingCanvas" xmlns:cx="http://schemas.microsoft.com/office/drawing/2014/chartex" xmlns:cx1="http://schemas.microsoft.com/office/drawing/2015/9/8/chartex" xmlns:cx2="http://schemas.microsoft.com/office/drawing/2015/10/21/chartex" xmlns:cx3="http://schemas.microsoft.com/office/drawing/2016/5/9/chartex" xmlns:cx4="http://schemas.microsoft.com/office/drawing/2016/5/10/chartex" xmlns:cx5="http://schemas.microsoft.com/office/drawing/2016/5/11/chartex" xmlns:cx6="http://schemas.microsoft.com/office/drawing/2016/5/12/chartex" xmlns:cx7="http://schemas.microsoft.com/office/drawing/2016/5/13/chartex" xmlns:cx8="http://schemas.microsoft.com/office/drawing/2016/5/14/chartex" xmlns:mc="http://schemas.openxmlformats.org/markup-compatibility/2006" xmlns:aink="http://schemas.microsoft.com/office/drawing/2016/ink" xmlns:am3d="http://schemas.microsoft.com/office/drawing/2017/model3d" xmlns:o="urn:schemas-microsoft-com:office:office" xmlns:oel="http://schemas.microsoft.com/office/2019/extlst" xmlns:r="http://schemas.openxmlformats.org/officeDocument/2006/relationships" xmlns:m="http://schemas.openxmlformats.org/officeDocument/2006/math" xmlns:v="urn:schemas-microsoft-com:vml" xmlns:wp14="http://schemas.microsoft.com/office/word/2010/wordprocessingDrawing" xmlns:wp="http://schemas.openxmlformats.org/drawingml/2006/wordprocessingDrawing" xmlns:w10="urn:schemas-microsoft-com:office:word" xmlns:w="http://schemas.openxmlformats.org/wordprocessingml/2006/main" xmlns:w14="http://schemas.microsoft.com/office/word/2010/wordml" xmlns:w15="http://schemas.microsoft.com/office/word/2012/wordml" xmlns:w16cex="http://schemas.microsoft.com/office/word/2018/wordml/cex" xmlns:w16cid="http://schemas.microsoft.com/office/word/2016/wordml/cid" xmlns:w16="http://schemas.microsoft.com/office/word/2018/wordml" xmlns:w16du="http://schemas.microsoft.com/office/word/2023/wordml/word16du" xmlns:w16sdtdh="http://schemas.microsoft.com/office/word/2020/wordml/sdtdatahash" xmlns:w16sdtfl="http://schemas.microsoft.com/office/word/2024/wordml/sdtformatlock" xmlns:w16se="http://schemas.microsoft.com/office/word/2015/wordml/symex" xmlns:wpg="http://schemas.microsoft.com/office/word/2010/wordprocessingGroup" xmlns:wpi="http://schemas.microsoft.com/office/word/2010/wordprocessingInk" xmlns:wne="http://schemas.microsoft.com/office/word/2006/wordml" xmlns:wps="http://schemas.microsoft.com/office/word/2010/wordprocessingShape" mc:Ignorable="w14 w15 w16se w16cid w16 w16cex w16sdtdh w16sdtfl w16du wp14">
-  <w:p>
-    <w:pPr>
-      <w:pStyle w:val="Header"/>
     </w:pPr>
   </w:p>
 </w:hdr>
@@ -2709,7 +2730,6 @@
   <w:style w:type="character" w:default="1" w:styleId="DefaultParagraphFont">
     <w:name w:val="Default Paragraph Font"/>
     <w:uiPriority w:val="1"/>
-    <w:semiHidden/>
     <w:unhideWhenUsed/>
   </w:style>
   <w:style w:type="table" w:default="1" w:styleId="TableNormal">
@@ -3124,7 +3144,6 @@
 
 <file path=docMetadata/LabelInfo.xml><?xml version="1.0" encoding="utf-8"?>
 <clbl:labelList xmlns:clbl="http://schemas.microsoft.com/office/2020/mipLabelMetadata">
-  <clbl:label id="{d9290083-bd2f-48a2-8ac5-09a524b17d15}" enabled="1" method="Privileged" siteId="{b9fec68c-c92d-461e-9a97-3d03a0f18b82}" contentBits="1" removed="0"/>
   <clbl:label id="{e0793d39-0939-496d-b129-198edd916feb}" enabled="0" method="" siteId="{e0793d39-0939-496d-b129-198edd916feb}" removed="1"/>
 </clbl:labelList>
 </file>
</xml_diff>